<commit_message>
Add rupture de stage feature with API endpoints, update .env.example for rupture paths, enhance admin sidebar for rupture access, and modify student picker for improved dropdown positioning
</commit_message>
<xml_diff>
--- a/templates/ModeleRupturedeconvention.docx
+++ b/templates/ModeleRupturedeconvention.docx
@@ -14,14 +14,14 @@
         <w:ind w:left="2268" w:right="2268"/>
         <w:jc w:val="center"/>
         <w:rPr>
-          <w:rStyle w:val="Strong"/>
+          <w:rStyle w:val="lev"/>
           <w:rFonts w:ascii="Calibri" w:hAnsi="Calibri"/>
           <w:sz w:val="28"/>
         </w:rPr>
       </w:pPr>
       <w:r>
         <w:rPr>
-          <w:rStyle w:val="Strong"/>
+          <w:rStyle w:val="lev"/>
           <w:rFonts w:ascii="Calibri" w:hAnsi="Calibri"/>
           <w:sz w:val="28"/>
         </w:rPr>
@@ -29,7 +29,7 @@
       </w:r>
       <w:r>
         <w:rPr>
-          <w:rStyle w:val="Strong"/>
+          <w:rStyle w:val="lev"/>
           <w:rFonts w:ascii="Calibri" w:hAnsi="Calibri"/>
           <w:sz w:val="28"/>
         </w:rPr>
@@ -37,7 +37,7 @@
       </w:r>
       <w:r>
         <w:rPr>
-          <w:rStyle w:val="Strong"/>
+          <w:rStyle w:val="lev"/>
           <w:rFonts w:ascii="Calibri" w:hAnsi="Calibri"/>
           <w:sz w:val="28"/>
         </w:rPr>
@@ -45,7 +45,7 @@
       </w:r>
       <w:r>
         <w:rPr>
-          <w:rStyle w:val="Strong"/>
+          <w:rStyle w:val="lev"/>
           <w:rFonts w:ascii="Calibri" w:hAnsi="Calibri"/>
           <w:sz w:val="28"/>
         </w:rPr>
@@ -75,7 +75,7 @@
       </w:pPr>
       <w:r>
         <w:rPr>
-          <w:rStyle w:val="Strong"/>
+          <w:rStyle w:val="lev"/>
           <w:rFonts w:asciiTheme="minorHAnsi" w:hAnsiTheme="minorHAnsi"/>
           <w:i/>
           <w:color w:val="365F91" w:themeColor="accent1" w:themeShade="BF"/>
@@ -151,7 +151,7 @@
     </w:p>
     <w:tbl>
       <w:tblPr>
-        <w:tblStyle w:val="TableGrid"/>
+        <w:tblStyle w:val="Grilledutableau"/>
         <w:tblW w:w="10632" w:type="dxa"/>
         <w:tblCellMar>
           <w:left w:w="57" w:type="dxa"/>
@@ -390,48 +390,7 @@
                 <w:sz w:val="18"/>
                 <w:szCs w:val="18"/>
               </w:rPr>
-              <w:fldChar w:fldCharType="begin"/>
-            </w:r>
-            <w:r>
-              <w:rPr>
-                <w:rFonts w:ascii="DIN" w:hAnsi="DIN"/>
-                <w:bCs/>
-                <w:iCs/>
-                <w:sz w:val="18"/>
-                <w:szCs w:val="18"/>
-              </w:rPr>
-              <w:instrText xml:space="preserve"> MERGEFIELD "Nom_entreprise" </w:instrText>
-            </w:r>
-            <w:r>
-              <w:rPr>
-                <w:rFonts w:ascii="DIN" w:hAnsi="DIN"/>
-                <w:bCs/>
-                <w:iCs/>
-                <w:sz w:val="18"/>
-                <w:szCs w:val="18"/>
-              </w:rPr>
-              <w:fldChar w:fldCharType="separate"/>
-            </w:r>
-            <w:r>
-              <w:rPr>
-                <w:rFonts w:ascii="DIN" w:hAnsi="DIN"/>
-                <w:bCs/>
-                <w:iCs/>
-                <w:noProof/>
-                <w:sz w:val="18"/>
-                <w:szCs w:val="18"/>
-              </w:rPr>
-              <w:t>Nom_entreprise</w:t>
-            </w:r>
-            <w:r>
-              <w:rPr>
-                <w:rFonts w:ascii="DIN" w:hAnsi="DIN"/>
-                <w:bCs/>
-                <w:iCs/>
-                <w:sz w:val="18"/>
-                <w:szCs w:val="18"/>
-              </w:rPr>
-              <w:fldChar w:fldCharType="end"/>
+              <w:t xml:space="preserve">{Nom_entreprise}</w:t>
             </w:r>
           </w:p>
         </w:tc>
@@ -552,14 +511,25 @@
                 <w:szCs w:val="18"/>
               </w:rPr>
             </w:pPr>
-            <w:r>
-              <w:rPr>
-                <w:rFonts w:ascii="DIN" w:hAnsi="DIN"/>
-                <w:b/>
-                <w:sz w:val="18"/>
-                <w:szCs w:val="18"/>
-              </w:rPr>
-              <w:t>Ecole Ducasse – Paris Campus</w:t>
+            <w:proofErr w:type="spellStart"/>
+            <w:r>
+              <w:rPr>
+                <w:rFonts w:ascii="DIN" w:hAnsi="DIN"/>
+                <w:b/>
+                <w:sz w:val="18"/>
+                <w:szCs w:val="18"/>
+              </w:rPr>
+              <w:t>Ecole</w:t>
+            </w:r>
+            <w:proofErr w:type="spellEnd"/>
+            <w:r>
+              <w:rPr>
+                <w:rFonts w:ascii="DIN" w:hAnsi="DIN"/>
+                <w:b/>
+                <w:sz w:val="18"/>
+                <w:szCs w:val="18"/>
+              </w:rPr>
+              <w:t xml:space="preserve"> Ducasse – Paris Campus</w:t>
             </w:r>
           </w:p>
         </w:tc>
@@ -605,8 +575,9 @@
                 <w:sz w:val="18"/>
                 <w:szCs w:val="18"/>
               </w:rPr>
-              <w:t xml:space="preserve"> Represented</w:t>
-            </w:r>
+              <w:t xml:space="preserve"> </w:t>
+            </w:r>
+            <w:proofErr w:type="spellStart"/>
             <w:r>
               <w:rPr>
                 <w:rFonts w:ascii="DIN" w:hAnsi="DIN"/>
@@ -616,8 +587,9 @@
                 <w:sz w:val="18"/>
                 <w:szCs w:val="18"/>
               </w:rPr>
-              <w:t xml:space="preserve"> </w:t>
-            </w:r>
+              <w:t>Represented</w:t>
+            </w:r>
+            <w:proofErr w:type="spellEnd"/>
             <w:r>
               <w:rPr>
                 <w:rFonts w:ascii="DIN" w:hAnsi="DIN"/>
@@ -627,7 +599,7 @@
                 <w:sz w:val="18"/>
                 <w:szCs w:val="18"/>
               </w:rPr>
-              <w:t xml:space="preserve">   </w:t>
+              <w:t xml:space="preserve"> </w:t>
             </w:r>
             <w:r>
               <w:rPr>
@@ -638,7 +610,7 @@
                 <w:sz w:val="18"/>
                 <w:szCs w:val="18"/>
               </w:rPr>
-              <w:t>b</w:t>
+              <w:t xml:space="preserve">   </w:t>
             </w:r>
             <w:r>
               <w:rPr>
@@ -649,8 +621,20 @@
                 <w:sz w:val="18"/>
                 <w:szCs w:val="18"/>
               </w:rPr>
+              <w:t>b</w:t>
+            </w:r>
+            <w:r>
+              <w:rPr>
+                <w:rFonts w:ascii="DIN" w:hAnsi="DIN"/>
+                <w:b/>
+                <w:i/>
+                <w:color w:val="365F91" w:themeColor="accent1" w:themeShade="BF"/>
+                <w:sz w:val="18"/>
+                <w:szCs w:val="18"/>
+              </w:rPr>
               <w:t>y</w:t>
             </w:r>
+            <w:proofErr w:type="gramStart"/>
             <w:r>
               <w:rPr>
                 <w:rFonts w:ascii="DIN" w:hAnsi="DIN"/>
@@ -675,82 +659,15 @@
               </w:rPr>
               <w:t xml:space="preserve"> </w:t>
             </w:r>
-            <w:r>
-              <w:rPr>
-                <w:rFonts w:ascii="DIN" w:hAnsi="DIN"/>
-                <w:sz w:val="18"/>
-                <w:szCs w:val="18"/>
-              </w:rPr>
-              <w:fldChar w:fldCharType="begin"/>
-            </w:r>
-            <w:r>
-              <w:rPr>
-                <w:rFonts w:ascii="DIN" w:hAnsi="DIN"/>
-                <w:sz w:val="18"/>
-                <w:szCs w:val="18"/>
-              </w:rPr>
-              <w:instrText xml:space="preserve"> MERGEFIELD "Représentée_par" </w:instrText>
-            </w:r>
-            <w:r>
-              <w:rPr>
-                <w:rFonts w:ascii="DIN" w:hAnsi="DIN"/>
-                <w:sz w:val="18"/>
-                <w:szCs w:val="18"/>
-              </w:rPr>
-              <w:fldChar w:fldCharType="separate"/>
-            </w:r>
-            <w:r>
-              <w:rPr>
-                <w:rFonts w:ascii="DIN" w:hAnsi="DIN"/>
-                <w:noProof/>
-                <w:sz w:val="18"/>
-                <w:szCs w:val="18"/>
-              </w:rPr>
-              <w:t>Repr</w:t>
-            </w:r>
-            <w:r>
-              <w:rPr>
-                <w:rFonts w:ascii="DIN" w:hAnsi="DIN"/>
-                <w:noProof/>
-                <w:sz w:val="18"/>
-                <w:szCs w:val="18"/>
-              </w:rPr>
-              <w:t>e</w:t>
-            </w:r>
-            <w:r>
-              <w:rPr>
-                <w:rFonts w:ascii="DIN" w:hAnsi="DIN"/>
-                <w:noProof/>
-                <w:sz w:val="18"/>
-                <w:szCs w:val="18"/>
-              </w:rPr>
-              <w:t>sent</w:t>
-            </w:r>
-            <w:r>
-              <w:rPr>
-                <w:rFonts w:ascii="DIN" w:hAnsi="DIN"/>
-                <w:noProof/>
-                <w:sz w:val="18"/>
-                <w:szCs w:val="18"/>
-              </w:rPr>
-              <w:t>e</w:t>
-            </w:r>
-            <w:r>
-              <w:rPr>
-                <w:rFonts w:ascii="DIN" w:hAnsi="DIN"/>
-                <w:noProof/>
-                <w:sz w:val="18"/>
-                <w:szCs w:val="18"/>
-              </w:rPr>
-              <w:t>e_par</w:t>
-            </w:r>
-            <w:r>
-              <w:rPr>
-                <w:rFonts w:ascii="DIN" w:hAnsi="DIN"/>
-                <w:sz w:val="18"/>
-                <w:szCs w:val="18"/>
-              </w:rPr>
-              <w:fldChar w:fldCharType="end"/>
+            <w:proofErr w:type="spellStart"/>
+            <w:proofErr w:type="gramEnd"/>
+            <w:r>
+              <w:rPr>
+                <w:rFonts w:ascii="DIN" w:hAnsi="DIN"/>
+                <w:sz w:val="18"/>
+                <w:szCs w:val="18"/>
+              </w:rPr>
+              <w:t xml:space="preserve">{Representee_par}</w:t>
             </w:r>
           </w:p>
         </w:tc>
@@ -823,6 +740,7 @@
               </w:rPr>
               <w:t xml:space="preserve">Représenté par / </w:t>
             </w:r>
+            <w:proofErr w:type="spellStart"/>
             <w:r>
               <w:rPr>
                 <w:rFonts w:ascii="DIN" w:hAnsi="DIN"/>
@@ -832,7 +750,19 @@
                 <w:sz w:val="18"/>
                 <w:szCs w:val="18"/>
               </w:rPr>
-              <w:t>Represented by</w:t>
+              <w:t>Represented</w:t>
+            </w:r>
+            <w:proofErr w:type="spellEnd"/>
+            <w:r>
+              <w:rPr>
+                <w:rFonts w:ascii="DIN" w:hAnsi="DIN"/>
+                <w:b/>
+                <w:i/>
+                <w:color w:val="365F91" w:themeColor="accent1" w:themeShade="BF"/>
+                <w:sz w:val="18"/>
+                <w:szCs w:val="18"/>
+              </w:rPr>
+              <w:t xml:space="preserve"> by</w:t>
             </w:r>
             <w:r>
               <w:rPr>
@@ -900,15 +830,27 @@
                 <w:szCs w:val="18"/>
               </w:rPr>
             </w:pPr>
-            <w:r>
-              <w:rPr>
-                <w:rFonts w:ascii="DIN" w:hAnsi="DIN"/>
-                <w:b/>
-                <w:sz w:val="18"/>
-                <w:szCs w:val="18"/>
-              </w:rPr>
-              <w:t xml:space="preserve">en qualité de / </w:t>
-            </w:r>
+            <w:proofErr w:type="gramStart"/>
+            <w:r>
+              <w:rPr>
+                <w:rFonts w:ascii="DIN" w:hAnsi="DIN"/>
+                <w:b/>
+                <w:sz w:val="18"/>
+                <w:szCs w:val="18"/>
+              </w:rPr>
+              <w:t>en</w:t>
+            </w:r>
+            <w:proofErr w:type="gramEnd"/>
+            <w:r>
+              <w:rPr>
+                <w:rFonts w:ascii="DIN" w:hAnsi="DIN"/>
+                <w:b/>
+                <w:sz w:val="18"/>
+                <w:szCs w:val="18"/>
+              </w:rPr>
+              <w:t xml:space="preserve"> qualité de / </w:t>
+            </w:r>
+            <w:proofErr w:type="spellStart"/>
             <w:r>
               <w:rPr>
                 <w:rFonts w:ascii="DIN" w:hAnsi="DIN"/>
@@ -918,8 +860,9 @@
                 <w:sz w:val="18"/>
                 <w:szCs w:val="18"/>
               </w:rPr>
-              <w:t xml:space="preserve">title </w:t>
-            </w:r>
+              <w:t>title</w:t>
+            </w:r>
+            <w:proofErr w:type="spellEnd"/>
             <w:r>
               <w:rPr>
                 <w:rFonts w:ascii="DIN" w:hAnsi="DIN"/>
@@ -934,75 +877,23 @@
             <w:r>
               <w:rPr>
                 <w:rFonts w:ascii="DIN" w:hAnsi="DIN"/>
+                <w:b/>
+                <w:i/>
+                <w:color w:val="365F91" w:themeColor="accent1" w:themeShade="BF"/>
+                <w:sz w:val="18"/>
+                <w:szCs w:val="18"/>
+              </w:rPr>
+              <w:t xml:space="preserve"> </w:t>
+            </w:r>
+            <w:r>
+              <w:rPr>
+                <w:rFonts w:ascii="DIN" w:hAnsi="DIN"/>
                 <w:bCs/>
                 <w:iCs/>
                 <w:sz w:val="18"/>
                 <w:szCs w:val="18"/>
               </w:rPr>
-              <w:fldChar w:fldCharType="begin"/>
-            </w:r>
-            <w:r>
-              <w:rPr>
-                <w:rFonts w:ascii="DIN" w:hAnsi="DIN"/>
-                <w:bCs/>
-                <w:iCs/>
-                <w:sz w:val="18"/>
-                <w:szCs w:val="18"/>
-              </w:rPr>
-              <w:instrText xml:space="preserve"> MERGEFIELD "En_qualité_de" </w:instrText>
-            </w:r>
-            <w:r>
-              <w:rPr>
-                <w:rFonts w:ascii="DIN" w:hAnsi="DIN"/>
-                <w:bCs/>
-                <w:iCs/>
-                <w:sz w:val="18"/>
-                <w:szCs w:val="18"/>
-              </w:rPr>
-              <w:fldChar w:fldCharType="separate"/>
-            </w:r>
-            <w:r>
-              <w:rPr>
-                <w:rFonts w:ascii="DIN" w:hAnsi="DIN"/>
-                <w:bCs/>
-                <w:iCs/>
-                <w:noProof/>
-                <w:sz w:val="18"/>
-                <w:szCs w:val="18"/>
-              </w:rPr>
-              <w:t>En_qualit</w:t>
-            </w:r>
-            <w:r>
-              <w:rPr>
-                <w:rFonts w:ascii="DIN" w:hAnsi="DIN"/>
-                <w:bCs/>
-                <w:iCs/>
-                <w:noProof/>
-                <w:sz w:val="18"/>
-                <w:szCs w:val="18"/>
-              </w:rPr>
-              <w:t>e</w:t>
-            </w:r>
-            <w:r>
-              <w:rPr>
-                <w:rFonts w:ascii="DIN" w:hAnsi="DIN"/>
-                <w:bCs/>
-                <w:iCs/>
-                <w:noProof/>
-                <w:sz w:val="18"/>
-                <w:szCs w:val="18"/>
-              </w:rPr>
-              <w:t>_de</w:t>
-            </w:r>
-            <w:r>
-              <w:rPr>
-                <w:rFonts w:ascii="DIN" w:hAnsi="DIN"/>
-                <w:bCs/>
-                <w:iCs/>
-                <w:sz w:val="18"/>
-                <w:szCs w:val="18"/>
-              </w:rPr>
-              <w:fldChar w:fldCharType="end"/>
+              <w:t xml:space="preserve">{En_qualite_de}</w:t>
             </w:r>
           </w:p>
         </w:tc>
@@ -1065,15 +956,27 @@
                 <w:szCs w:val="18"/>
               </w:rPr>
             </w:pPr>
-            <w:r>
-              <w:rPr>
-                <w:rFonts w:ascii="DIN" w:hAnsi="DIN"/>
-                <w:b/>
-                <w:sz w:val="18"/>
-                <w:szCs w:val="18"/>
-              </w:rPr>
-              <w:t xml:space="preserve">en qualité de / </w:t>
-            </w:r>
+            <w:proofErr w:type="gramStart"/>
+            <w:r>
+              <w:rPr>
+                <w:rFonts w:ascii="DIN" w:hAnsi="DIN"/>
+                <w:b/>
+                <w:sz w:val="18"/>
+                <w:szCs w:val="18"/>
+              </w:rPr>
+              <w:t>en</w:t>
+            </w:r>
+            <w:proofErr w:type="gramEnd"/>
+            <w:r>
+              <w:rPr>
+                <w:rFonts w:ascii="DIN" w:hAnsi="DIN"/>
+                <w:b/>
+                <w:sz w:val="18"/>
+                <w:szCs w:val="18"/>
+              </w:rPr>
+              <w:t xml:space="preserve"> qualité de / </w:t>
+            </w:r>
+            <w:proofErr w:type="spellStart"/>
             <w:r>
               <w:rPr>
                 <w:rFonts w:ascii="DIN" w:hAnsi="DIN"/>
@@ -1085,6 +988,7 @@
               </w:rPr>
               <w:t>title</w:t>
             </w:r>
+            <w:proofErr w:type="spellEnd"/>
             <w:r>
               <w:rPr>
                 <w:rFonts w:ascii="DIN" w:hAnsi="DIN"/>
@@ -1181,6 +1085,7 @@
               </w:rPr>
               <w:t xml:space="preserve">Adresse / </w:t>
             </w:r>
+            <w:proofErr w:type="spellStart"/>
             <w:r>
               <w:rPr>
                 <w:rFonts w:ascii="DIN" w:hAnsi="DIN"/>
@@ -1192,6 +1097,8 @@
               </w:rPr>
               <w:t>Address</w:t>
             </w:r>
+            <w:proofErr w:type="spellEnd"/>
+            <w:proofErr w:type="gramStart"/>
             <w:r>
               <w:rPr>
                 <w:rFonts w:ascii="DIN" w:hAnsi="DIN"/>
@@ -1216,46 +1123,15 @@
               </w:rPr>
               <w:t xml:space="preserve"> </w:t>
             </w:r>
-            <w:r>
-              <w:rPr>
-                <w:rFonts w:ascii="DIN" w:hAnsi="DIN"/>
-                <w:sz w:val="18"/>
-                <w:szCs w:val="18"/>
-              </w:rPr>
-              <w:fldChar w:fldCharType="begin"/>
-            </w:r>
-            <w:r>
-              <w:rPr>
-                <w:rFonts w:ascii="DIN" w:hAnsi="DIN"/>
-                <w:sz w:val="18"/>
-                <w:szCs w:val="18"/>
-              </w:rPr>
-              <w:instrText xml:space="preserve"> MERGEFIELD "Adresse_entreprise" </w:instrText>
-            </w:r>
-            <w:r>
-              <w:rPr>
-                <w:rFonts w:ascii="DIN" w:hAnsi="DIN"/>
-                <w:sz w:val="18"/>
-                <w:szCs w:val="18"/>
-              </w:rPr>
-              <w:fldChar w:fldCharType="separate"/>
-            </w:r>
-            <w:r>
-              <w:rPr>
-                <w:rFonts w:ascii="DIN" w:hAnsi="DIN"/>
-                <w:noProof/>
-                <w:sz w:val="18"/>
-                <w:szCs w:val="18"/>
-              </w:rPr>
-              <w:t>Adresse_entreprise</w:t>
-            </w:r>
-            <w:r>
-              <w:rPr>
-                <w:rFonts w:ascii="DIN" w:hAnsi="DIN"/>
-                <w:sz w:val="18"/>
-                <w:szCs w:val="18"/>
-              </w:rPr>
-              <w:fldChar w:fldCharType="end"/>
+            <w:proofErr w:type="spellStart"/>
+            <w:proofErr w:type="gramEnd"/>
+            <w:r>
+              <w:rPr>
+                <w:rFonts w:ascii="DIN" w:hAnsi="DIN"/>
+                <w:sz w:val="18"/>
+                <w:szCs w:val="18"/>
+              </w:rPr>
+              <w:t xml:space="preserve">{Adresse_entreprise}</w:t>
             </w:r>
           </w:p>
         </w:tc>
@@ -1356,6 +1232,7 @@
               </w:rPr>
               <w:t xml:space="preserve"> </w:t>
             </w:r>
+            <w:proofErr w:type="spellStart"/>
             <w:r>
               <w:rPr>
                 <w:rFonts w:ascii="DIN" w:hAnsi="DIN"/>
@@ -1367,6 +1244,7 @@
               </w:rPr>
               <w:t>Address</w:t>
             </w:r>
+            <w:proofErr w:type="spellEnd"/>
             <w:r>
               <w:rPr>
                 <w:rFonts w:ascii="DIN" w:hAnsi="DIN"/>
@@ -1401,8 +1279,18 @@
                 <w:sz w:val="18"/>
                 <w:szCs w:val="18"/>
               </w:rPr>
-              <w:t>16 avenue du Maréchal Juin</w:t>
-            </w:r>
+              <w:t xml:space="preserve">16 avenue du Maréchal </w:t>
+            </w:r>
+            <w:proofErr w:type="gramStart"/>
+            <w:r>
+              <w:rPr>
+                <w:rFonts w:ascii="DIN" w:hAnsi="DIN"/>
+                <w:sz w:val="18"/>
+                <w:szCs w:val="18"/>
+              </w:rPr>
+              <w:t>Juin</w:t>
+            </w:r>
+            <w:proofErr w:type="gramEnd"/>
           </w:p>
         </w:tc>
       </w:tr>
@@ -1512,48 +1400,7 @@
                     <w:sz w:val="18"/>
                     <w:szCs w:val="18"/>
                   </w:rPr>
-                  <w:fldChar w:fldCharType="begin"/>
-                </w:r>
-                <w:r>
-                  <w:rPr>
-                    <w:rFonts w:ascii="DIN" w:hAnsi="DIN"/>
-                    <w:bCs/>
-                    <w:iCs/>
-                    <w:sz w:val="18"/>
-                    <w:szCs w:val="18"/>
-                  </w:rPr>
-                  <w:instrText xml:space="preserve"> MERGEFIELD "Ville_entreprise" </w:instrText>
-                </w:r>
-                <w:r>
-                  <w:rPr>
-                    <w:rFonts w:ascii="DIN" w:hAnsi="DIN"/>
-                    <w:bCs/>
-                    <w:iCs/>
-                    <w:sz w:val="18"/>
-                    <w:szCs w:val="18"/>
-                  </w:rPr>
-                  <w:fldChar w:fldCharType="separate"/>
-                </w:r>
-                <w:r>
-                  <w:rPr>
-                    <w:rFonts w:ascii="DIN" w:hAnsi="DIN"/>
-                    <w:bCs/>
-                    <w:iCs/>
-                    <w:noProof/>
-                    <w:sz w:val="18"/>
-                    <w:szCs w:val="18"/>
-                  </w:rPr>
-                  <w:t>Ville_entreprise</w:t>
-                </w:r>
-                <w:r>
-                  <w:rPr>
-                    <w:rFonts w:ascii="DIN" w:hAnsi="DIN"/>
-                    <w:bCs/>
-                    <w:iCs/>
-                    <w:sz w:val="18"/>
-                    <w:szCs w:val="18"/>
-                  </w:rPr>
-                  <w:fldChar w:fldCharType="end"/>
+                  <w:t xml:space="preserve">{Ville_entreprise}</w:t>
                 </w:r>
               </w:sdtContent>
             </w:sdt>
@@ -1792,48 +1639,7 @@
                     <w:sz w:val="18"/>
                     <w:szCs w:val="18"/>
                   </w:rPr>
-                  <w:fldChar w:fldCharType="begin"/>
-                </w:r>
-                <w:r>
-                  <w:rPr>
-                    <w:rFonts w:ascii="DIN" w:hAnsi="DIN"/>
-                    <w:bCs/>
-                    <w:iCs/>
-                    <w:sz w:val="18"/>
-                    <w:szCs w:val="18"/>
-                  </w:rPr>
-                  <w:instrText xml:space="preserve"> MERGEFIELD "Pays_entreprise" </w:instrText>
-                </w:r>
-                <w:r>
-                  <w:rPr>
-                    <w:rFonts w:ascii="DIN" w:hAnsi="DIN"/>
-                    <w:bCs/>
-                    <w:iCs/>
-                    <w:sz w:val="18"/>
-                    <w:szCs w:val="18"/>
-                  </w:rPr>
-                  <w:fldChar w:fldCharType="separate"/>
-                </w:r>
-                <w:r>
-                  <w:rPr>
-                    <w:rFonts w:ascii="DIN" w:hAnsi="DIN"/>
-                    <w:bCs/>
-                    <w:iCs/>
-                    <w:noProof/>
-                    <w:sz w:val="18"/>
-                    <w:szCs w:val="18"/>
-                  </w:rPr>
-                  <w:t>Pays_entreprise</w:t>
-                </w:r>
-                <w:r>
-                  <w:rPr>
-                    <w:rFonts w:ascii="DIN" w:hAnsi="DIN"/>
-                    <w:bCs/>
-                    <w:iCs/>
-                    <w:sz w:val="18"/>
-                    <w:szCs w:val="18"/>
-                  </w:rPr>
-                  <w:fldChar w:fldCharType="end"/>
+                  <w:t xml:space="preserve">{Pays_entreprise}</w:t>
                 </w:r>
               </w:sdtContent>
             </w:sdt>
@@ -1875,6 +1681,7 @@
               </w:rPr>
               <w:t>Zip Code</w:t>
             </w:r>
+            <w:proofErr w:type="gramStart"/>
             <w:r>
               <w:rPr>
                 <w:rFonts w:ascii="DIN" w:hAnsi="DIN"/>
@@ -1891,46 +1698,15 @@
               </w:rPr>
               <w:t xml:space="preserve">  </w:t>
             </w:r>
-            <w:r>
-              <w:rPr>
-                <w:rFonts w:ascii="DIN" w:hAnsi="DIN"/>
-                <w:sz w:val="18"/>
-                <w:szCs w:val="18"/>
-              </w:rPr>
-              <w:fldChar w:fldCharType="begin"/>
-            </w:r>
-            <w:r>
-              <w:rPr>
-                <w:rFonts w:ascii="DIN" w:hAnsi="DIN"/>
-                <w:sz w:val="18"/>
-                <w:szCs w:val="18"/>
-              </w:rPr>
-              <w:instrText xml:space="preserve"> MERGEFIELD "Code_Postal_entreprise" </w:instrText>
-            </w:r>
-            <w:r>
-              <w:rPr>
-                <w:rFonts w:ascii="DIN" w:hAnsi="DIN"/>
-                <w:sz w:val="18"/>
-                <w:szCs w:val="18"/>
-              </w:rPr>
-              <w:fldChar w:fldCharType="separate"/>
-            </w:r>
-            <w:r>
-              <w:rPr>
-                <w:rFonts w:ascii="DIN" w:hAnsi="DIN"/>
-                <w:noProof/>
-                <w:sz w:val="18"/>
-                <w:szCs w:val="18"/>
-              </w:rPr>
-              <w:t>Code_Postal_entreprise</w:t>
-            </w:r>
-            <w:r>
-              <w:rPr>
-                <w:rFonts w:ascii="DIN" w:hAnsi="DIN"/>
-                <w:sz w:val="18"/>
-                <w:szCs w:val="18"/>
-              </w:rPr>
-              <w:fldChar w:fldCharType="end"/>
+            <w:proofErr w:type="spellStart"/>
+            <w:proofErr w:type="gramEnd"/>
+            <w:r>
+              <w:rPr>
+                <w:rFonts w:ascii="DIN" w:hAnsi="DIN"/>
+                <w:sz w:val="18"/>
+                <w:szCs w:val="18"/>
+              </w:rPr>
+              <w:t xml:space="preserve">{Code_Postal_entreprise}</w:t>
             </w:r>
           </w:p>
         </w:tc>
@@ -2095,6 +1871,7 @@
               </w:rPr>
               <w:t>Phone</w:t>
             </w:r>
+            <w:proofErr w:type="gramStart"/>
             <w:r>
               <w:rPr>
                 <w:rFonts w:ascii="DIN" w:hAnsi="DIN"/>
@@ -2111,82 +1888,15 @@
               </w:rPr>
               <w:t xml:space="preserve">  </w:t>
             </w:r>
-            <w:r>
-              <w:rPr>
-                <w:rFonts w:ascii="DIN" w:hAnsi="DIN"/>
-                <w:sz w:val="18"/>
-                <w:szCs w:val="18"/>
-              </w:rPr>
-              <w:fldChar w:fldCharType="begin"/>
-            </w:r>
-            <w:r>
-              <w:rPr>
-                <w:rFonts w:ascii="DIN" w:hAnsi="DIN"/>
-                <w:sz w:val="18"/>
-                <w:szCs w:val="18"/>
-              </w:rPr>
-              <w:instrText xml:space="preserve"> MERGEFIELD "Téléphone_Mail_entreprise" </w:instrText>
-            </w:r>
-            <w:r>
-              <w:rPr>
-                <w:rFonts w:ascii="DIN" w:hAnsi="DIN"/>
-                <w:sz w:val="18"/>
-                <w:szCs w:val="18"/>
-              </w:rPr>
-              <w:fldChar w:fldCharType="separate"/>
-            </w:r>
-            <w:r>
-              <w:rPr>
-                <w:rFonts w:ascii="DIN" w:hAnsi="DIN"/>
-                <w:noProof/>
-                <w:sz w:val="18"/>
-                <w:szCs w:val="18"/>
-              </w:rPr>
-              <w:t>T</w:t>
-            </w:r>
-            <w:r>
-              <w:rPr>
-                <w:rFonts w:ascii="DIN" w:hAnsi="DIN"/>
-                <w:noProof/>
-                <w:sz w:val="18"/>
-                <w:szCs w:val="18"/>
-              </w:rPr>
-              <w:t>e</w:t>
-            </w:r>
-            <w:r>
-              <w:rPr>
-                <w:rFonts w:ascii="DIN" w:hAnsi="DIN"/>
-                <w:noProof/>
-                <w:sz w:val="18"/>
-                <w:szCs w:val="18"/>
-              </w:rPr>
-              <w:t>l</w:t>
-            </w:r>
-            <w:r>
-              <w:rPr>
-                <w:rFonts w:ascii="DIN" w:hAnsi="DIN"/>
-                <w:noProof/>
-                <w:sz w:val="18"/>
-                <w:szCs w:val="18"/>
-              </w:rPr>
-              <w:t>e</w:t>
-            </w:r>
-            <w:r>
-              <w:rPr>
-                <w:rFonts w:ascii="DIN" w:hAnsi="DIN"/>
-                <w:noProof/>
-                <w:sz w:val="18"/>
-                <w:szCs w:val="18"/>
-              </w:rPr>
-              <w:t>phone_Mail_entreprise</w:t>
-            </w:r>
-            <w:r>
-              <w:rPr>
-                <w:rFonts w:ascii="DIN" w:hAnsi="DIN"/>
-                <w:sz w:val="18"/>
-                <w:szCs w:val="18"/>
-              </w:rPr>
-              <w:fldChar w:fldCharType="end"/>
+            <w:proofErr w:type="spellStart"/>
+            <w:proofErr w:type="gramEnd"/>
+            <w:r>
+              <w:rPr>
+                <w:rFonts w:ascii="DIN" w:hAnsi="DIN"/>
+                <w:sz w:val="18"/>
+                <w:szCs w:val="18"/>
+              </w:rPr>
+              <w:t xml:space="preserve">{Telephone_Mail_entreprise}</w:t>
             </w:r>
           </w:p>
         </w:tc>
@@ -2422,6 +2132,7 @@
               </w:rPr>
               <w:t xml:space="preserve"> </w:t>
             </w:r>
+            <w:proofErr w:type="spellStart"/>
             <w:r>
               <w:rPr>
                 <w:rFonts w:ascii="DIN" w:hAnsi="DIN"/>
@@ -2433,6 +2144,7 @@
               </w:rPr>
               <w:t>Company’s</w:t>
             </w:r>
+            <w:proofErr w:type="spellEnd"/>
             <w:r>
               <w:rPr>
                 <w:rFonts w:ascii="DIN" w:hAnsi="DIN"/>
@@ -2453,8 +2165,21 @@
                 <w:sz w:val="18"/>
                 <w:szCs w:val="18"/>
               </w:rPr>
-              <w:t>registration number</w:t>
-            </w:r>
+              <w:t xml:space="preserve">registration </w:t>
+            </w:r>
+            <w:proofErr w:type="spellStart"/>
+            <w:r>
+              <w:rPr>
+                <w:rFonts w:ascii="DIN" w:hAnsi="DIN"/>
+                <w:b/>
+                <w:i/>
+                <w:color w:val="365F91" w:themeColor="accent1" w:themeShade="BF"/>
+                <w:sz w:val="18"/>
+                <w:szCs w:val="18"/>
+              </w:rPr>
+              <w:t>number</w:t>
+            </w:r>
+            <w:proofErr w:type="spellEnd"/>
             <w:r>
               <w:rPr>
                 <w:rFonts w:ascii="DIN" w:hAnsi="DIN"/>
@@ -2463,91 +2188,14 @@
               </w:rPr>
               <w:t xml:space="preserve"> </w:t>
             </w:r>
-            <w:r>
-              <w:rPr>
-                <w:rFonts w:ascii="DIN" w:hAnsi="DIN"/>
-                <w:sz w:val="18"/>
-                <w:szCs w:val="18"/>
-              </w:rPr>
-              <w:fldChar w:fldCharType="begin"/>
-            </w:r>
-            <w:r>
-              <w:rPr>
-                <w:rFonts w:ascii="DIN" w:hAnsi="DIN"/>
-                <w:sz w:val="18"/>
-                <w:szCs w:val="18"/>
-              </w:rPr>
-              <w:instrText xml:space="preserve"> MERGEFIELD Numéro_dimmatruculation_entreprise_SIR </w:instrText>
-            </w:r>
-            <w:r>
-              <w:rPr>
-                <w:rFonts w:ascii="DIN" w:hAnsi="DIN"/>
-                <w:sz w:val="18"/>
-                <w:szCs w:val="18"/>
-              </w:rPr>
-              <w:fldChar w:fldCharType="separate"/>
-            </w:r>
-            <w:r>
-              <w:rPr>
-                <w:rFonts w:ascii="DIN" w:hAnsi="DIN"/>
-                <w:noProof/>
-                <w:sz w:val="18"/>
-                <w:szCs w:val="18"/>
-              </w:rPr>
-              <w:t>Num</w:t>
-            </w:r>
-            <w:r>
-              <w:rPr>
-                <w:rFonts w:ascii="DIN" w:hAnsi="DIN"/>
-                <w:noProof/>
-                <w:sz w:val="18"/>
-                <w:szCs w:val="18"/>
-              </w:rPr>
-              <w:t>e</w:t>
-            </w:r>
-            <w:r>
-              <w:rPr>
-                <w:rFonts w:ascii="DIN" w:hAnsi="DIN"/>
-                <w:noProof/>
-                <w:sz w:val="18"/>
-                <w:szCs w:val="18"/>
-              </w:rPr>
-              <w:t>ro_dimmatr</w:t>
-            </w:r>
-            <w:r>
-              <w:rPr>
-                <w:rFonts w:ascii="DIN" w:hAnsi="DIN"/>
-                <w:noProof/>
-                <w:sz w:val="18"/>
-                <w:szCs w:val="18"/>
-              </w:rPr>
-              <w:t>i</w:t>
-            </w:r>
-            <w:r>
-              <w:rPr>
-                <w:rFonts w:ascii="DIN" w:hAnsi="DIN"/>
-                <w:noProof/>
-                <w:sz w:val="18"/>
-                <w:szCs w:val="18"/>
-              </w:rPr>
-              <w:t>culation_entreprise_SI</w:t>
-            </w:r>
-            <w:r>
-              <w:rPr>
-                <w:rFonts w:ascii="DIN" w:hAnsi="DIN"/>
-                <w:noProof/>
-                <w:sz w:val="18"/>
-                <w:szCs w:val="18"/>
-              </w:rPr>
-              <w:t>RET</w:t>
-            </w:r>
-            <w:r>
-              <w:rPr>
-                <w:rFonts w:ascii="DIN" w:hAnsi="DIN"/>
-                <w:sz w:val="18"/>
-                <w:szCs w:val="18"/>
-              </w:rPr>
-              <w:fldChar w:fldCharType="end"/>
+            <w:proofErr w:type="spellStart"/>
+            <w:r>
+              <w:rPr>
+                <w:rFonts w:ascii="DIN" w:hAnsi="DIN"/>
+                <w:sz w:val="18"/>
+                <w:szCs w:val="18"/>
+              </w:rPr>
+              <w:t xml:space="preserve">{Numero_dimmatruculation_entreprise_SIRET}</w:t>
             </w:r>
           </w:p>
         </w:tc>
@@ -2667,7 +2315,29 @@
                 <w:szCs w:val="18"/>
                 <w:lang w:val="en-US"/>
               </w:rPr>
-              <w:t xml:space="preserve">Nom du tuteur / </w:t>
+              <w:t xml:space="preserve">Nom du </w:t>
+            </w:r>
+            <w:proofErr w:type="spellStart"/>
+            <w:r>
+              <w:rPr>
+                <w:rFonts w:ascii="DIN" w:hAnsi="DIN"/>
+                <w:b/>
+                <w:sz w:val="18"/>
+                <w:szCs w:val="18"/>
+                <w:lang w:val="en-US"/>
+              </w:rPr>
+              <w:t>tuteur</w:t>
+            </w:r>
+            <w:proofErr w:type="spellEnd"/>
+            <w:r>
+              <w:rPr>
+                <w:rFonts w:ascii="DIN" w:hAnsi="DIN"/>
+                <w:b/>
+                <w:sz w:val="18"/>
+                <w:szCs w:val="18"/>
+                <w:lang w:val="en-US"/>
+              </w:rPr>
+              <w:t xml:space="preserve"> / </w:t>
             </w:r>
             <w:r>
               <w:rPr>
@@ -2712,46 +2382,14 @@
                 <w:szCs w:val="18"/>
               </w:rPr>
             </w:pPr>
-            <w:r>
-              <w:rPr>
-                <w:rFonts w:ascii="DIN" w:hAnsi="DIN"/>
-                <w:sz w:val="18"/>
-                <w:szCs w:val="18"/>
-              </w:rPr>
-              <w:fldChar w:fldCharType="begin"/>
-            </w:r>
-            <w:r>
-              <w:rPr>
-                <w:rFonts w:ascii="DIN" w:hAnsi="DIN"/>
-                <w:sz w:val="18"/>
-                <w:szCs w:val="18"/>
-              </w:rPr>
-              <w:instrText xml:space="preserve"> MERGEFIELD "Nom_tuteur" </w:instrText>
-            </w:r>
-            <w:r>
-              <w:rPr>
-                <w:rFonts w:ascii="DIN" w:hAnsi="DIN"/>
-                <w:sz w:val="18"/>
-                <w:szCs w:val="18"/>
-              </w:rPr>
-              <w:fldChar w:fldCharType="separate"/>
-            </w:r>
-            <w:r>
-              <w:rPr>
-                <w:rFonts w:ascii="DIN" w:hAnsi="DIN"/>
-                <w:noProof/>
-                <w:sz w:val="18"/>
-                <w:szCs w:val="18"/>
-              </w:rPr>
-              <w:t>Nom_tuteur</w:t>
-            </w:r>
-            <w:r>
-              <w:rPr>
-                <w:rFonts w:ascii="DIN" w:hAnsi="DIN"/>
-                <w:sz w:val="18"/>
-                <w:szCs w:val="18"/>
-              </w:rPr>
-              <w:fldChar w:fldCharType="end"/>
+            <w:proofErr w:type="spellStart"/>
+            <w:r>
+              <w:rPr>
+                <w:rFonts w:ascii="DIN" w:hAnsi="DIN"/>
+                <w:sz w:val="18"/>
+                <w:szCs w:val="18"/>
+              </w:rPr>
+              <w:t xml:space="preserve">{Nom_tuteur}</w:t>
             </w:r>
           </w:p>
         </w:tc>
@@ -2802,6 +2440,7 @@
               </w:rPr>
               <w:t xml:space="preserve">Nom du formateur référent / </w:t>
             </w:r>
+            <w:proofErr w:type="spellStart"/>
             <w:r>
               <w:rPr>
                 <w:rFonts w:ascii="DIN" w:hAnsi="DIN"/>
@@ -2811,8 +2450,57 @@
                 <w:sz w:val="18"/>
                 <w:szCs w:val="18"/>
               </w:rPr>
-              <w:t>Responsible Instructor’s name</w:t>
-            </w:r>
+              <w:t>Responsible</w:t>
+            </w:r>
+            <w:proofErr w:type="spellEnd"/>
+            <w:r>
+              <w:rPr>
+                <w:rFonts w:ascii="DIN" w:hAnsi="DIN"/>
+                <w:b/>
+                <w:i/>
+                <w:color w:val="365F91" w:themeColor="accent1" w:themeShade="BF"/>
+                <w:sz w:val="18"/>
+                <w:szCs w:val="18"/>
+              </w:rPr>
+              <w:t xml:space="preserve"> </w:t>
+            </w:r>
+            <w:proofErr w:type="spellStart"/>
+            <w:r>
+              <w:rPr>
+                <w:rFonts w:ascii="DIN" w:hAnsi="DIN"/>
+                <w:b/>
+                <w:i/>
+                <w:color w:val="365F91" w:themeColor="accent1" w:themeShade="BF"/>
+                <w:sz w:val="18"/>
+                <w:szCs w:val="18"/>
+              </w:rPr>
+              <w:t>Instructor’s</w:t>
+            </w:r>
+            <w:proofErr w:type="spellEnd"/>
+            <w:r>
+              <w:rPr>
+                <w:rFonts w:ascii="DIN" w:hAnsi="DIN"/>
+                <w:b/>
+                <w:i/>
+                <w:color w:val="365F91" w:themeColor="accent1" w:themeShade="BF"/>
+                <w:sz w:val="18"/>
+                <w:szCs w:val="18"/>
+              </w:rPr>
+              <w:t xml:space="preserve"> </w:t>
+            </w:r>
+            <w:proofErr w:type="spellStart"/>
+            <w:r>
+              <w:rPr>
+                <w:rFonts w:ascii="DIN" w:hAnsi="DIN"/>
+                <w:b/>
+                <w:i/>
+                <w:color w:val="365F91" w:themeColor="accent1" w:themeShade="BF"/>
+                <w:sz w:val="18"/>
+                <w:szCs w:val="18"/>
+              </w:rPr>
+              <w:t>name</w:t>
+            </w:r>
+            <w:proofErr w:type="spellEnd"/>
           </w:p>
         </w:tc>
         <w:tc>
@@ -2915,48 +2603,7 @@
                 <w:sz w:val="18"/>
                 <w:szCs w:val="18"/>
               </w:rPr>
-              <w:fldChar w:fldCharType="begin"/>
-            </w:r>
-            <w:r>
-              <w:rPr>
-                <w:rFonts w:ascii="DIN" w:hAnsi="DIN"/>
-                <w:bCs/>
-                <w:iCs/>
-                <w:sz w:val="18"/>
-                <w:szCs w:val="18"/>
-              </w:rPr>
-              <w:instrText xml:space="preserve"> MERGEFIELD "Fonction_tuteur" </w:instrText>
-            </w:r>
-            <w:r>
-              <w:rPr>
-                <w:rFonts w:ascii="DIN" w:hAnsi="DIN"/>
-                <w:bCs/>
-                <w:iCs/>
-                <w:sz w:val="18"/>
-                <w:szCs w:val="18"/>
-              </w:rPr>
-              <w:fldChar w:fldCharType="separate"/>
-            </w:r>
-            <w:r>
-              <w:rPr>
-                <w:rFonts w:ascii="DIN" w:hAnsi="DIN"/>
-                <w:bCs/>
-                <w:iCs/>
-                <w:noProof/>
-                <w:sz w:val="18"/>
-                <w:szCs w:val="18"/>
-              </w:rPr>
-              <w:t>Fonction_tuteur</w:t>
-            </w:r>
-            <w:r>
-              <w:rPr>
-                <w:rFonts w:ascii="DIN" w:hAnsi="DIN"/>
-                <w:bCs/>
-                <w:iCs/>
-                <w:sz w:val="18"/>
-                <w:szCs w:val="18"/>
-              </w:rPr>
-              <w:fldChar w:fldCharType="end"/>
+              <w:t xml:space="preserve">{Fonction_tuteur}</w:t>
             </w:r>
           </w:p>
         </w:tc>
@@ -3116,135 +2763,29 @@
                 <w:sz w:val="18"/>
                 <w:szCs w:val="18"/>
               </w:rPr>
-              <w:fldChar w:fldCharType="begin"/>
-            </w:r>
-            <w:r>
+              <w:t xml:space="preserve">{Numero_tuteur}</w:t>
+            </w:r>
+          </w:p>
+          <w:p>
+            <w:pPr>
               <w:rPr>
                 <w:rFonts w:ascii="DIN" w:hAnsi="DIN"/>
                 <w:bCs/>
                 <w:iCs/>
-                <w:noProof/>
-                <w:sz w:val="18"/>
-                <w:szCs w:val="18"/>
-              </w:rPr>
-              <w:instrText xml:space="preserve"> MERGEFIELD Numéro_tuteur </w:instrText>
-            </w:r>
+                <w:sz w:val="18"/>
+                <w:szCs w:val="18"/>
+              </w:rPr>
+            </w:pPr>
+            <w:proofErr w:type="spellStart"/>
             <w:r>
               <w:rPr>
                 <w:rFonts w:ascii="DIN" w:hAnsi="DIN"/>
                 <w:bCs/>
                 <w:iCs/>
-                <w:noProof/>
-                <w:sz w:val="18"/>
-                <w:szCs w:val="18"/>
-              </w:rPr>
-              <w:fldChar w:fldCharType="separate"/>
-            </w:r>
-            <w:r>
-              <w:rPr>
-                <w:rFonts w:ascii="DIN" w:hAnsi="DIN"/>
-                <w:bCs/>
-                <w:iCs/>
-                <w:noProof/>
-                <w:sz w:val="18"/>
-                <w:szCs w:val="18"/>
-              </w:rPr>
-              <w:t>Num</w:t>
-            </w:r>
-            <w:r>
-              <w:rPr>
-                <w:rFonts w:ascii="DIN" w:hAnsi="DIN"/>
-                <w:bCs/>
-                <w:iCs/>
-                <w:noProof/>
-                <w:sz w:val="18"/>
-                <w:szCs w:val="18"/>
-              </w:rPr>
-              <w:t>e</w:t>
-            </w:r>
-            <w:r>
-              <w:rPr>
-                <w:rFonts w:ascii="DIN" w:hAnsi="DIN"/>
-                <w:bCs/>
-                <w:iCs/>
-                <w:noProof/>
-                <w:sz w:val="18"/>
-                <w:szCs w:val="18"/>
-              </w:rPr>
-              <w:t>ro_tuteur</w:t>
-            </w:r>
-            <w:r>
-              <w:rPr>
-                <w:rFonts w:ascii="DIN" w:hAnsi="DIN"/>
-                <w:bCs/>
-                <w:iCs/>
-                <w:noProof/>
-                <w:sz w:val="18"/>
-                <w:szCs w:val="18"/>
-              </w:rPr>
-              <w:fldChar w:fldCharType="end"/>
-            </w:r>
-          </w:p>
-          <w:p>
-            <w:pPr>
-              <w:rPr>
-                <w:rFonts w:ascii="DIN" w:hAnsi="DIN"/>
-                <w:bCs/>
-                <w:iCs/>
-                <w:sz w:val="18"/>
-                <w:szCs w:val="18"/>
-              </w:rPr>
-            </w:pPr>
-            <w:r>
-              <w:rPr>
-                <w:rFonts w:ascii="DIN" w:hAnsi="DIN"/>
-                <w:bCs/>
-                <w:iCs/>
-                <w:sz w:val="18"/>
-                <w:szCs w:val="18"/>
-              </w:rPr>
-              <w:fldChar w:fldCharType="begin"/>
-            </w:r>
-            <w:r>
-              <w:rPr>
-                <w:rFonts w:ascii="DIN" w:hAnsi="DIN"/>
-                <w:bCs/>
-                <w:iCs/>
-                <w:sz w:val="18"/>
-                <w:szCs w:val="18"/>
-              </w:rPr>
-              <w:instrText xml:space="preserve"> MERGEFIELD "Mail_tuteur" </w:instrText>
-            </w:r>
-            <w:r>
-              <w:rPr>
-                <w:rFonts w:ascii="DIN" w:hAnsi="DIN"/>
-                <w:bCs/>
-                <w:iCs/>
-                <w:sz w:val="18"/>
-                <w:szCs w:val="18"/>
-              </w:rPr>
-              <w:fldChar w:fldCharType="separate"/>
-            </w:r>
-            <w:r>
-              <w:rPr>
-                <w:rFonts w:ascii="DIN" w:hAnsi="DIN"/>
-                <w:bCs/>
-                <w:iCs/>
-                <w:noProof/>
-                <w:sz w:val="18"/>
-                <w:szCs w:val="18"/>
-              </w:rPr>
-              <w:t>Mail_tuteur</w:t>
-            </w:r>
-            <w:r>
-              <w:rPr>
-                <w:rFonts w:ascii="DIN" w:hAnsi="DIN"/>
-                <w:bCs/>
-                <w:iCs/>
-                <w:sz w:val="18"/>
-                <w:szCs w:val="18"/>
-              </w:rPr>
-              <w:fldChar w:fldCharType="end"/>
+                <w:sz w:val="18"/>
+                <w:szCs w:val="18"/>
+              </w:rPr>
+              <w:t xml:space="preserve">{Mail_tuteur}</w:t>
             </w:r>
           </w:p>
         </w:tc>
@@ -3568,6 +3109,7 @@
                 <w:sz w:val="24"/>
               </w:rPr>
             </w:pPr>
+            <w:proofErr w:type="gramStart"/>
             <w:r>
               <w:rPr>
                 <w:rFonts w:asciiTheme="minorHAnsi" w:hAnsiTheme="minorHAnsi"/>
@@ -3576,6 +3118,7 @@
               </w:rPr>
               <w:t>STAGIAIRE  /</w:t>
             </w:r>
+            <w:proofErr w:type="gramEnd"/>
             <w:r>
               <w:rPr>
                 <w:rFonts w:asciiTheme="minorHAnsi" w:hAnsiTheme="minorHAnsi"/>
@@ -3673,8 +3216,21 @@
                 <w:sz w:val="18"/>
                 <w:szCs w:val="18"/>
               </w:rPr>
-              <w:t>Last name</w:t>
-            </w:r>
+              <w:t xml:space="preserve">Last </w:t>
+            </w:r>
+            <w:proofErr w:type="spellStart"/>
+            <w:r>
+              <w:rPr>
+                <w:rFonts w:ascii="DIN Pro Regular" w:hAnsi="DIN Pro Regular" w:cs="DIN Pro Regular"/>
+                <w:b/>
+                <w:i/>
+                <w:color w:val="365F91" w:themeColor="accent1" w:themeShade="BF"/>
+                <w:sz w:val="18"/>
+                <w:szCs w:val="18"/>
+              </w:rPr>
+              <w:t>name</w:t>
+            </w:r>
+            <w:proofErr w:type="spellEnd"/>
           </w:p>
         </w:tc>
         <w:tc>
@@ -3692,55 +3248,14 @@
                 <w:szCs w:val="18"/>
               </w:rPr>
             </w:pPr>
+            <w:proofErr w:type="spellStart"/>
             <w:r>
               <w:rPr>
                 <w:rFonts w:ascii="DIN Pro Regular" w:hAnsi="DIN Pro Regular" w:cs="DIN Pro Regular"/>
                 <w:sz w:val="18"/>
                 <w:szCs w:val="18"/>
               </w:rPr>
-              <w:fldChar w:fldCharType="begin"/>
-            </w:r>
-            <w:r>
-              <w:rPr>
-                <w:rFonts w:ascii="DIN Pro Regular" w:hAnsi="DIN Pro Regular" w:cs="DIN Pro Regular"/>
-                <w:sz w:val="18"/>
-                <w:szCs w:val="18"/>
-              </w:rPr>
-              <w:instrText xml:space="preserve"> MERGEFIELD "Nom_stagiaire" </w:instrText>
-            </w:r>
-            <w:r>
-              <w:rPr>
-                <w:rFonts w:ascii="DIN Pro Regular" w:hAnsi="DIN Pro Regular" w:cs="DIN Pro Regular"/>
-                <w:sz w:val="18"/>
-                <w:szCs w:val="18"/>
-              </w:rPr>
-              <w:fldChar w:fldCharType="separate"/>
-            </w:r>
-            <w:r>
-              <w:rPr>
-                <w:rFonts w:ascii="DIN Pro Regular" w:hAnsi="DIN Pro Regular" w:cs="DIN Pro Regular"/>
-                <w:noProof/>
-                <w:sz w:val="18"/>
-                <w:szCs w:val="18"/>
-              </w:rPr>
-              <w:t>Nom_</w:t>
-            </w:r>
-            <w:r>
-              <w:rPr>
-                <w:rFonts w:ascii="DIN Pro Regular" w:hAnsi="DIN Pro Regular" w:cs="DIN Pro Regular"/>
-                <w:noProof/>
-                <w:sz w:val="18"/>
-                <w:szCs w:val="18"/>
-              </w:rPr>
-              <w:t>Etud</w:t>
-            </w:r>
-            <w:r>
-              <w:rPr>
-                <w:rFonts w:ascii="DIN Pro Regular" w:hAnsi="DIN Pro Regular" w:cs="DIN Pro Regular"/>
-                <w:sz w:val="18"/>
-                <w:szCs w:val="18"/>
-              </w:rPr>
-              <w:fldChar w:fldCharType="end"/>
+              <w:t xml:space="preserve">{Nom_Etud}</w:t>
             </w:r>
           </w:p>
         </w:tc>
@@ -3764,6 +3279,7 @@
                 <w:lang w:val="en-US"/>
               </w:rPr>
             </w:pPr>
+            <w:proofErr w:type="spellStart"/>
             <w:r>
               <w:rPr>
                 <w:rFonts w:ascii="DIN Pro Regular" w:hAnsi="DIN Pro Regular" w:cs="DIN Pro Regular"/>
@@ -3772,7 +3288,18 @@
                 <w:szCs w:val="18"/>
                 <w:lang w:val="en-US"/>
               </w:rPr>
-              <w:t xml:space="preserve">Adresse / </w:t>
+              <w:t>Adresse</w:t>
+            </w:r>
+            <w:proofErr w:type="spellEnd"/>
+            <w:r>
+              <w:rPr>
+                <w:rFonts w:ascii="DIN Pro Regular" w:hAnsi="DIN Pro Regular" w:cs="DIN Pro Regular"/>
+                <w:b/>
+                <w:sz w:val="18"/>
+                <w:szCs w:val="18"/>
+                <w:lang w:val="en-US"/>
+              </w:rPr>
+              <w:t xml:space="preserve"> / </w:t>
             </w:r>
             <w:r>
               <w:rPr>
@@ -3802,55 +3329,14 @@
                 <w:szCs w:val="18"/>
               </w:rPr>
             </w:pPr>
+            <w:proofErr w:type="spellStart"/>
             <w:r>
               <w:rPr>
                 <w:rFonts w:ascii="DIN Pro Regular" w:hAnsi="DIN Pro Regular" w:cs="DIN Pro Regular"/>
                 <w:sz w:val="18"/>
                 <w:szCs w:val="18"/>
               </w:rPr>
-              <w:fldChar w:fldCharType="begin"/>
-            </w:r>
-            <w:r>
-              <w:rPr>
-                <w:rFonts w:ascii="DIN Pro Regular" w:hAnsi="DIN Pro Regular" w:cs="DIN Pro Regular"/>
-                <w:sz w:val="18"/>
-                <w:szCs w:val="18"/>
-              </w:rPr>
-              <w:instrText xml:space="preserve"> MERGEFIELD "Adresse_stagiaire" </w:instrText>
-            </w:r>
-            <w:r>
-              <w:rPr>
-                <w:rFonts w:ascii="DIN Pro Regular" w:hAnsi="DIN Pro Regular" w:cs="DIN Pro Regular"/>
-                <w:sz w:val="18"/>
-                <w:szCs w:val="18"/>
-              </w:rPr>
-              <w:fldChar w:fldCharType="separate"/>
-            </w:r>
-            <w:r>
-              <w:rPr>
-                <w:rFonts w:ascii="DIN Pro Regular" w:hAnsi="DIN Pro Regular" w:cs="DIN Pro Regular"/>
-                <w:noProof/>
-                <w:sz w:val="18"/>
-                <w:szCs w:val="18"/>
-              </w:rPr>
-              <w:t>Adresse_</w:t>
-            </w:r>
-            <w:r>
-              <w:rPr>
-                <w:rFonts w:ascii="DIN Pro Regular" w:hAnsi="DIN Pro Regular" w:cs="DIN Pro Regular"/>
-                <w:noProof/>
-                <w:sz w:val="18"/>
-                <w:szCs w:val="18"/>
-              </w:rPr>
-              <w:t>etudiant</w:t>
-            </w:r>
-            <w:r>
-              <w:rPr>
-                <w:rFonts w:ascii="DIN Pro Regular" w:hAnsi="DIN Pro Regular" w:cs="DIN Pro Regular"/>
-                <w:sz w:val="18"/>
-                <w:szCs w:val="18"/>
-              </w:rPr>
-              <w:fldChar w:fldCharType="end"/>
+              <w:t xml:space="preserve">{Adresse_etudiant}</w:t>
             </w:r>
           </w:p>
         </w:tc>
@@ -3897,8 +3383,21 @@
                 <w:sz w:val="18"/>
                 <w:szCs w:val="18"/>
               </w:rPr>
-              <w:t>First name</w:t>
-            </w:r>
+              <w:t xml:space="preserve">First </w:t>
+            </w:r>
+            <w:proofErr w:type="spellStart"/>
+            <w:r>
+              <w:rPr>
+                <w:rFonts w:ascii="DIN Pro Regular" w:hAnsi="DIN Pro Regular" w:cs="DIN Pro Regular"/>
+                <w:b/>
+                <w:i/>
+                <w:color w:val="365F91" w:themeColor="accent1" w:themeShade="BF"/>
+                <w:sz w:val="18"/>
+                <w:szCs w:val="18"/>
+              </w:rPr>
+              <w:t>name</w:t>
+            </w:r>
+            <w:proofErr w:type="spellEnd"/>
           </w:p>
         </w:tc>
         <w:tc>
@@ -3916,91 +3415,14 @@
                 <w:szCs w:val="18"/>
               </w:rPr>
             </w:pPr>
+            <w:proofErr w:type="spellStart"/>
             <w:r>
               <w:rPr>
                 <w:rFonts w:ascii="DIN Pro Regular" w:hAnsi="DIN Pro Regular" w:cs="DIN Pro Regular"/>
                 <w:sz w:val="18"/>
                 <w:szCs w:val="18"/>
               </w:rPr>
-              <w:fldChar w:fldCharType="begin"/>
-            </w:r>
-            <w:r>
-              <w:rPr>
-                <w:rFonts w:ascii="DIN Pro Regular" w:hAnsi="DIN Pro Regular" w:cs="DIN Pro Regular"/>
-                <w:sz w:val="18"/>
-                <w:szCs w:val="18"/>
-              </w:rPr>
-              <w:instrText xml:space="preserve"> MERGEFIELD "Prénom_stagaire" </w:instrText>
-            </w:r>
-            <w:r>
-              <w:rPr>
-                <w:rFonts w:ascii="DIN Pro Regular" w:hAnsi="DIN Pro Regular" w:cs="DIN Pro Regular"/>
-                <w:sz w:val="18"/>
-                <w:szCs w:val="18"/>
-              </w:rPr>
-              <w:fldChar w:fldCharType="separate"/>
-            </w:r>
-            <w:r>
-              <w:rPr>
-                <w:rFonts w:ascii="DIN Pro Regular" w:hAnsi="DIN Pro Regular" w:cs="DIN Pro Regular"/>
-                <w:noProof/>
-                <w:sz w:val="18"/>
-                <w:szCs w:val="18"/>
-              </w:rPr>
-              <w:t>Pr</w:t>
-            </w:r>
-            <w:r>
-              <w:rPr>
-                <w:rFonts w:ascii="DIN Pro Regular" w:hAnsi="DIN Pro Regular" w:cs="DIN Pro Regular"/>
-                <w:noProof/>
-                <w:sz w:val="18"/>
-                <w:szCs w:val="18"/>
-              </w:rPr>
-              <w:t>e</w:t>
-            </w:r>
-            <w:r>
-              <w:rPr>
-                <w:rFonts w:ascii="DIN Pro Regular" w:hAnsi="DIN Pro Regular" w:cs="DIN Pro Regular"/>
-                <w:noProof/>
-                <w:sz w:val="18"/>
-                <w:szCs w:val="18"/>
-              </w:rPr>
-              <w:t>no</w:t>
-            </w:r>
-            <w:r>
-              <w:rPr>
-                <w:rFonts w:ascii="DIN Pro Regular" w:hAnsi="DIN Pro Regular" w:cs="DIN Pro Regular"/>
-                <w:noProof/>
-                <w:sz w:val="18"/>
-                <w:szCs w:val="18"/>
-              </w:rPr>
-              <w:t>o</w:t>
-            </w:r>
-            <w:r>
-              <w:rPr>
-                <w:rFonts w:ascii="DIN Pro Regular" w:hAnsi="DIN Pro Regular" w:cs="DIN Pro Regular"/>
-                <w:noProof/>
-                <w:sz w:val="18"/>
-                <w:szCs w:val="18"/>
-              </w:rPr>
-              <w:t>m_</w:t>
-            </w:r>
-            <w:r>
-              <w:rPr>
-                <w:rFonts w:ascii="DIN Pro Regular" w:hAnsi="DIN Pro Regular" w:cs="DIN Pro Regular"/>
-                <w:noProof/>
-                <w:sz w:val="18"/>
-                <w:szCs w:val="18"/>
-              </w:rPr>
-              <w:t>Etud</w:t>
-            </w:r>
-            <w:r>
-              <w:rPr>
-                <w:rFonts w:ascii="DIN Pro Regular" w:hAnsi="DIN Pro Regular" w:cs="DIN Pro Regular"/>
-                <w:sz w:val="18"/>
-                <w:szCs w:val="18"/>
-              </w:rPr>
-              <w:fldChar w:fldCharType="end"/>
+              <w:t xml:space="preserve">{Prenoom_Etud}</w:t>
             </w:r>
           </w:p>
         </w:tc>
@@ -4062,55 +3484,14 @@
                 <w:szCs w:val="18"/>
               </w:rPr>
             </w:pPr>
+            <w:proofErr w:type="spellStart"/>
             <w:r>
               <w:rPr>
                 <w:rFonts w:ascii="DIN Pro Regular" w:hAnsi="DIN Pro Regular" w:cs="DIN Pro Regular"/>
                 <w:sz w:val="18"/>
                 <w:szCs w:val="18"/>
               </w:rPr>
-              <w:fldChar w:fldCharType="begin"/>
-            </w:r>
-            <w:r>
-              <w:rPr>
-                <w:rFonts w:ascii="DIN Pro Regular" w:hAnsi="DIN Pro Regular" w:cs="DIN Pro Regular"/>
-                <w:sz w:val="18"/>
-                <w:szCs w:val="18"/>
-              </w:rPr>
-              <w:instrText xml:space="preserve"> MERGEFIELD "Code_Postal_stagiaire" </w:instrText>
-            </w:r>
-            <w:r>
-              <w:rPr>
-                <w:rFonts w:ascii="DIN Pro Regular" w:hAnsi="DIN Pro Regular" w:cs="DIN Pro Regular"/>
-                <w:sz w:val="18"/>
-                <w:szCs w:val="18"/>
-              </w:rPr>
-              <w:fldChar w:fldCharType="separate"/>
-            </w:r>
-            <w:r>
-              <w:rPr>
-                <w:rFonts w:ascii="DIN Pro Regular" w:hAnsi="DIN Pro Regular" w:cs="DIN Pro Regular"/>
-                <w:noProof/>
-                <w:sz w:val="18"/>
-                <w:szCs w:val="18"/>
-              </w:rPr>
-              <w:t>Code_Postal_</w:t>
-            </w:r>
-            <w:r>
-              <w:rPr>
-                <w:rFonts w:ascii="DIN Pro Regular" w:hAnsi="DIN Pro Regular" w:cs="DIN Pro Regular"/>
-                <w:noProof/>
-                <w:sz w:val="18"/>
-                <w:szCs w:val="18"/>
-              </w:rPr>
-              <w:t>etudiant</w:t>
-            </w:r>
-            <w:r>
-              <w:rPr>
-                <w:rFonts w:ascii="DIN Pro Regular" w:hAnsi="DIN Pro Regular" w:cs="DIN Pro Regular"/>
-                <w:sz w:val="18"/>
-                <w:szCs w:val="18"/>
-              </w:rPr>
-              <w:fldChar w:fldCharType="end"/>
+              <w:t xml:space="preserve">{Code_Postal_etudiant}</w:t>
             </w:r>
           </w:p>
         </w:tc>
@@ -4223,55 +3604,14 @@
                 <w:szCs w:val="18"/>
               </w:rPr>
             </w:pPr>
+            <w:proofErr w:type="spellStart"/>
             <w:r>
               <w:rPr>
                 <w:rFonts w:ascii="DIN Pro Regular" w:hAnsi="DIN Pro Regular" w:cs="DIN Pro Regular"/>
                 <w:sz w:val="18"/>
                 <w:szCs w:val="18"/>
               </w:rPr>
-              <w:fldChar w:fldCharType="begin"/>
-            </w:r>
-            <w:r>
-              <w:rPr>
-                <w:rFonts w:ascii="DIN Pro Regular" w:hAnsi="DIN Pro Regular" w:cs="DIN Pro Regular"/>
-                <w:sz w:val="18"/>
-                <w:szCs w:val="18"/>
-              </w:rPr>
-              <w:instrText xml:space="preserve"> MERGEFIELD "Date_de_naissance_stagiaire" </w:instrText>
-            </w:r>
-            <w:r>
-              <w:rPr>
-                <w:rFonts w:ascii="DIN Pro Regular" w:hAnsi="DIN Pro Regular" w:cs="DIN Pro Regular"/>
-                <w:sz w:val="18"/>
-                <w:szCs w:val="18"/>
-              </w:rPr>
-              <w:fldChar w:fldCharType="separate"/>
-            </w:r>
-            <w:r>
-              <w:rPr>
-                <w:rFonts w:ascii="DIN Pro Regular" w:hAnsi="DIN Pro Regular" w:cs="DIN Pro Regular"/>
-                <w:noProof/>
-                <w:sz w:val="18"/>
-                <w:szCs w:val="18"/>
-              </w:rPr>
-              <w:t>Date_de_naissance_</w:t>
-            </w:r>
-            <w:r>
-              <w:rPr>
-                <w:rFonts w:ascii="DIN Pro Regular" w:hAnsi="DIN Pro Regular" w:cs="DIN Pro Regular"/>
-                <w:noProof/>
-                <w:sz w:val="18"/>
-                <w:szCs w:val="18"/>
-              </w:rPr>
-              <w:t>etudiant</w:t>
-            </w:r>
-            <w:r>
-              <w:rPr>
-                <w:rFonts w:ascii="DIN Pro Regular" w:hAnsi="DIN Pro Regular" w:cs="DIN Pro Regular"/>
-                <w:sz w:val="18"/>
-                <w:szCs w:val="18"/>
-              </w:rPr>
-              <w:fldChar w:fldCharType="end"/>
+              <w:t xml:space="preserve">{Date_de_naissance_etudiant}</w:t>
             </w:r>
           </w:p>
         </w:tc>
@@ -4378,55 +3718,14 @@
                 <w:szCs w:val="18"/>
               </w:rPr>
             </w:pPr>
+            <w:proofErr w:type="spellStart"/>
             <w:r>
               <w:rPr>
                 <w:rFonts w:ascii="DIN Pro Regular" w:hAnsi="DIN Pro Regular" w:cs="DIN Pro Regular"/>
                 <w:sz w:val="18"/>
                 <w:szCs w:val="18"/>
               </w:rPr>
-              <w:fldChar w:fldCharType="begin"/>
-            </w:r>
-            <w:r>
-              <w:rPr>
-                <w:rFonts w:ascii="DIN Pro Regular" w:hAnsi="DIN Pro Regular" w:cs="DIN Pro Regular"/>
-                <w:sz w:val="18"/>
-                <w:szCs w:val="18"/>
-              </w:rPr>
-              <w:instrText xml:space="preserve"> MERGEFIELD "Ville_Pays_stagiaire" </w:instrText>
-            </w:r>
-            <w:r>
-              <w:rPr>
-                <w:rFonts w:ascii="DIN Pro Regular" w:hAnsi="DIN Pro Regular" w:cs="DIN Pro Regular"/>
-                <w:sz w:val="18"/>
-                <w:szCs w:val="18"/>
-              </w:rPr>
-              <w:fldChar w:fldCharType="separate"/>
-            </w:r>
-            <w:r>
-              <w:rPr>
-                <w:rFonts w:ascii="DIN Pro Regular" w:hAnsi="DIN Pro Regular" w:cs="DIN Pro Regular"/>
-                <w:noProof/>
-                <w:sz w:val="18"/>
-                <w:szCs w:val="18"/>
-              </w:rPr>
-              <w:t>Ville_Pays_</w:t>
-            </w:r>
-            <w:r>
-              <w:rPr>
-                <w:rFonts w:ascii="DIN Pro Regular" w:hAnsi="DIN Pro Regular" w:cs="DIN Pro Regular"/>
-                <w:noProof/>
-                <w:sz w:val="18"/>
-                <w:szCs w:val="18"/>
-              </w:rPr>
-              <w:t>etudiant</w:t>
-            </w:r>
-            <w:r>
-              <w:rPr>
-                <w:rFonts w:ascii="DIN Pro Regular" w:hAnsi="DIN Pro Regular" w:cs="DIN Pro Regular"/>
-                <w:sz w:val="18"/>
-                <w:szCs w:val="18"/>
-              </w:rPr>
-              <w:fldChar w:fldCharType="end"/>
+              <w:t xml:space="preserve">{Ville_Pays_etudiant}</w:t>
             </w:r>
           </w:p>
         </w:tc>
@@ -4493,6 +3792,7 @@
                 <w:szCs w:val="18"/>
               </w:rPr>
             </w:pPr>
+            <w:proofErr w:type="spellStart"/>
             <w:r>
               <w:rPr>
                 <w:rFonts w:ascii="DIN Pro Regular" w:hAnsi="DIN Pro Regular" w:cs="DIN Pro Regular"/>
@@ -4500,54 +3800,7 @@
                 <w:sz w:val="18"/>
                 <w:szCs w:val="18"/>
               </w:rPr>
-              <w:fldChar w:fldCharType="begin"/>
-            </w:r>
-            <w:r>
-              <w:rPr>
-                <w:rFonts w:ascii="DIN Pro Regular" w:hAnsi="DIN Pro Regular" w:cs="DIN Pro Regular"/>
-                <w:bCs/>
-                <w:sz w:val="18"/>
-                <w:szCs w:val="18"/>
-              </w:rPr>
-              <w:instrText xml:space="preserve"> MERGEFIELD "Programme_stagiaire" </w:instrText>
-            </w:r>
-            <w:r>
-              <w:rPr>
-                <w:rFonts w:ascii="DIN Pro Regular" w:hAnsi="DIN Pro Regular" w:cs="DIN Pro Regular"/>
-                <w:bCs/>
-                <w:sz w:val="18"/>
-                <w:szCs w:val="18"/>
-              </w:rPr>
-              <w:fldChar w:fldCharType="separate"/>
-            </w:r>
-            <w:r>
-              <w:rPr>
-                <w:rFonts w:ascii="DIN Pro Regular" w:hAnsi="DIN Pro Regular" w:cs="DIN Pro Regular"/>
-                <w:bCs/>
-                <w:noProof/>
-                <w:sz w:val="18"/>
-                <w:szCs w:val="18"/>
-              </w:rPr>
-              <w:t>Programme_</w:t>
-            </w:r>
-            <w:r>
-              <w:rPr>
-                <w:rFonts w:ascii="DIN Pro Regular" w:hAnsi="DIN Pro Regular" w:cs="DIN Pro Regular"/>
-                <w:bCs/>
-                <w:noProof/>
-                <w:sz w:val="18"/>
-                <w:szCs w:val="18"/>
-              </w:rPr>
-              <w:t>etudiant</w:t>
-            </w:r>
-            <w:r>
-              <w:rPr>
-                <w:rFonts w:ascii="DIN Pro Regular" w:hAnsi="DIN Pro Regular" w:cs="DIN Pro Regular"/>
-                <w:bCs/>
-                <w:sz w:val="18"/>
-                <w:szCs w:val="18"/>
-              </w:rPr>
-              <w:fldChar w:fldCharType="end"/>
+              <w:t xml:space="preserve">{Programme_etudiant}</w:t>
             </w:r>
           </w:p>
         </w:tc>
@@ -4571,6 +3824,7 @@
                 <w:lang w:val="en-US"/>
               </w:rPr>
             </w:pPr>
+            <w:proofErr w:type="spellStart"/>
             <w:r>
               <w:rPr>
                 <w:rFonts w:ascii="DIN Pro Regular" w:hAnsi="DIN Pro Regular" w:cs="DIN Pro Regular"/>
@@ -4579,12 +3833,23 @@
                 <w:szCs w:val="18"/>
                 <w:lang w:val="en-US"/>
               </w:rPr>
-              <w:t>Téléphone /</w:t>
-            </w:r>
+              <w:t>Téléphone</w:t>
+            </w:r>
+            <w:proofErr w:type="spellEnd"/>
             <w:r>
               <w:rPr>
                 <w:rFonts w:ascii="DIN Pro Regular" w:hAnsi="DIN Pro Regular" w:cs="DIN Pro Regular"/>
                 <w:b/>
+                <w:sz w:val="18"/>
+                <w:szCs w:val="18"/>
+                <w:lang w:val="en-US"/>
+              </w:rPr>
+              <w:t xml:space="preserve"> /</w:t>
+            </w:r>
+            <w:r>
+              <w:rPr>
+                <w:rFonts w:ascii="DIN Pro Regular" w:hAnsi="DIN Pro Regular" w:cs="DIN Pro Regular"/>
+                <w:b/>
                 <w:color w:val="365F91" w:themeColor="accent1" w:themeShade="BF"/>
                 <w:sz w:val="18"/>
                 <w:szCs w:val="18"/>
@@ -4611,6 +3876,7 @@
               </w:rPr>
               <w:t xml:space="preserve">Courriel / </w:t>
             </w:r>
+            <w:proofErr w:type="gramStart"/>
             <w:r>
               <w:rPr>
                 <w:rFonts w:ascii="DIN Pro Regular" w:hAnsi="DIN Pro Regular" w:cs="DIN Pro Regular"/>
@@ -4622,6 +3888,7 @@
               </w:rPr>
               <w:t>Email</w:t>
             </w:r>
+            <w:proofErr w:type="gramEnd"/>
             <w:r>
               <w:rPr>
                 <w:rFonts w:ascii="DIN Pro Regular" w:hAnsi="DIN Pro Regular" w:cs="DIN Pro Regular"/>
@@ -4648,109 +3915,34 @@
                 <w:szCs w:val="18"/>
               </w:rPr>
             </w:pPr>
+            <w:proofErr w:type="spellStart"/>
             <w:r>
               <w:rPr>
                 <w:rFonts w:ascii="DIN Pro Regular" w:hAnsi="DIN Pro Regular" w:cs="DIN Pro Regular"/>
                 <w:sz w:val="18"/>
                 <w:szCs w:val="18"/>
               </w:rPr>
-              <w:fldChar w:fldCharType="begin"/>
-            </w:r>
-            <w:r>
+              <w:t xml:space="preserve">{Telephone_etudiant}</w:t>
+            </w:r>
+          </w:p>
+          <w:p>
+            <w:pPr>
               <w:rPr>
                 <w:rFonts w:ascii="DIN Pro Regular" w:hAnsi="DIN Pro Regular" w:cs="DIN Pro Regular"/>
                 <w:sz w:val="18"/>
                 <w:szCs w:val="18"/>
               </w:rPr>
-              <w:instrText xml:space="preserve"> MERGEFIELD "Téléphone_Mail_stagiaire" </w:instrText>
-            </w:r>
+            </w:pPr>
+            <w:proofErr w:type="spellStart"/>
             <w:r>
               <w:rPr>
                 <w:rFonts w:ascii="DIN Pro Regular" w:hAnsi="DIN Pro Regular" w:cs="DIN Pro Regular"/>
                 <w:sz w:val="18"/>
                 <w:szCs w:val="18"/>
               </w:rPr>
-              <w:fldChar w:fldCharType="separate"/>
-            </w:r>
-            <w:r>
-              <w:rPr>
-                <w:rFonts w:ascii="DIN Pro Regular" w:hAnsi="DIN Pro Regular" w:cs="DIN Pro Regular"/>
-                <w:noProof/>
-                <w:sz w:val="18"/>
-                <w:szCs w:val="18"/>
-              </w:rPr>
-              <w:t>T</w:t>
-            </w:r>
-            <w:r>
-              <w:rPr>
-                <w:rFonts w:ascii="DIN Pro Regular" w:hAnsi="DIN Pro Regular" w:cs="DIN Pro Regular"/>
-                <w:noProof/>
-                <w:sz w:val="18"/>
-                <w:szCs w:val="18"/>
-              </w:rPr>
-              <w:t>e</w:t>
-            </w:r>
-            <w:r>
-              <w:rPr>
-                <w:rFonts w:ascii="DIN Pro Regular" w:hAnsi="DIN Pro Regular" w:cs="DIN Pro Regular"/>
-                <w:noProof/>
-                <w:sz w:val="18"/>
-                <w:szCs w:val="18"/>
-              </w:rPr>
-              <w:t>l</w:t>
-            </w:r>
-            <w:r>
-              <w:rPr>
-                <w:rFonts w:ascii="DIN Pro Regular" w:hAnsi="DIN Pro Regular" w:cs="DIN Pro Regular"/>
-                <w:noProof/>
-                <w:sz w:val="18"/>
-                <w:szCs w:val="18"/>
-              </w:rPr>
-              <w:t>e</w:t>
-            </w:r>
-            <w:r>
-              <w:rPr>
-                <w:rFonts w:ascii="DIN Pro Regular" w:hAnsi="DIN Pro Regular" w:cs="DIN Pro Regular"/>
-                <w:noProof/>
-                <w:sz w:val="18"/>
-                <w:szCs w:val="18"/>
-              </w:rPr>
-              <w:t>phone_</w:t>
-            </w:r>
-            <w:r>
-              <w:rPr>
-                <w:rFonts w:ascii="DIN Pro Regular" w:hAnsi="DIN Pro Regular" w:cs="DIN Pro Regular"/>
-                <w:noProof/>
-                <w:sz w:val="18"/>
-                <w:szCs w:val="18"/>
-              </w:rPr>
-              <w:t>etudiant</w:t>
-            </w:r>
-            <w:r>
-              <w:rPr>
-                <w:rFonts w:ascii="DIN Pro Regular" w:hAnsi="DIN Pro Regular" w:cs="DIN Pro Regular"/>
-                <w:sz w:val="18"/>
-                <w:szCs w:val="18"/>
-              </w:rPr>
-              <w:fldChar w:fldCharType="end"/>
-            </w:r>
-          </w:p>
-          <w:p>
-            <w:pPr>
-              <w:rPr>
-                <w:rFonts w:ascii="DIN Pro Regular" w:hAnsi="DIN Pro Regular" w:cs="DIN Pro Regular"/>
-                <w:sz w:val="18"/>
-                <w:szCs w:val="18"/>
-              </w:rPr>
-            </w:pPr>
-            <w:r>
-              <w:rPr>
-                <w:rFonts w:ascii="DIN Pro Regular" w:hAnsi="DIN Pro Regular" w:cs="DIN Pro Regular"/>
-                <w:sz w:val="18"/>
-                <w:szCs w:val="18"/>
-              </w:rPr>
               <w:t>Mail_etudiant</w:t>
             </w:r>
+            <w:proofErr w:type="spellEnd"/>
           </w:p>
         </w:tc>
       </w:tr>
@@ -4787,46 +3979,7 @@
         <w:rPr>
           <w:rFonts w:ascii="DIN" w:hAnsi="DIN"/>
         </w:rPr>
-        <w:fldChar w:fldCharType="begin"/>
-      </w:r>
-      <w:r>
-        <w:rPr>
-          <w:rFonts w:ascii="DIN" w:hAnsi="DIN"/>
-        </w:rPr>
-        <w:instrText xml:space="preserve"> MERGEFIELD "Date_début_stage" </w:instrText>
-      </w:r>
-      <w:r>
-        <w:rPr>
-          <w:rFonts w:ascii="DIN" w:hAnsi="DIN"/>
-        </w:rPr>
-        <w:fldChar w:fldCharType="separate"/>
-      </w:r>
-      <w:r>
-        <w:rPr>
-          <w:rFonts w:ascii="DIN" w:hAnsi="DIN"/>
-          <w:noProof/>
-        </w:rPr>
-        <w:t>Date_d</w:t>
-      </w:r>
-      <w:r>
-        <w:rPr>
-          <w:rFonts w:ascii="DIN" w:hAnsi="DIN"/>
-          <w:noProof/>
-        </w:rPr>
-        <w:t>e</w:t>
-      </w:r>
-      <w:r>
-        <w:rPr>
-          <w:rFonts w:ascii="DIN" w:hAnsi="DIN"/>
-          <w:noProof/>
-        </w:rPr>
-        <w:t>but_stage</w:t>
-      </w:r>
-      <w:r>
-        <w:rPr>
-          <w:rFonts w:ascii="DIN" w:hAnsi="DIN"/>
-        </w:rPr>
-        <w:fldChar w:fldCharType="end"/>
+        <w:t xml:space="preserve">{Date_debut_stage}</w:t>
       </w:r>
       <w:r>
         <w:rPr>
@@ -4838,32 +3991,7 @@
         <w:rPr>
           <w:rFonts w:ascii="DIN" w:hAnsi="DIN"/>
         </w:rPr>
-        <w:fldChar w:fldCharType="begin"/>
-      </w:r>
-      <w:r>
-        <w:rPr>
-          <w:rFonts w:ascii="DIN" w:hAnsi="DIN"/>
-        </w:rPr>
-        <w:instrText xml:space="preserve"> MERGEFIELD "Date_fin_stage" </w:instrText>
-      </w:r>
-      <w:r>
-        <w:rPr>
-          <w:rFonts w:ascii="DIN" w:hAnsi="DIN"/>
-        </w:rPr>
-        <w:fldChar w:fldCharType="separate"/>
-      </w:r>
-      <w:r>
-        <w:rPr>
-          <w:rFonts w:ascii="DIN" w:hAnsi="DIN"/>
-          <w:noProof/>
-        </w:rPr>
-        <w:t>Date_fin_stage</w:t>
-      </w:r>
-      <w:r>
-        <w:rPr>
-          <w:rFonts w:ascii="DIN" w:hAnsi="DIN"/>
-        </w:rPr>
-        <w:fldChar w:fldCharType="end"/>
+        <w:t xml:space="preserve">{Date_fin_stage}</w:t>
       </w:r>
       <w:r>
         <w:rPr>
@@ -4893,7 +4021,14 @@
         <w:rPr>
           <w:rFonts w:ascii="DIN" w:hAnsi="DIN"/>
         </w:rPr>
-        <w:t xml:space="preserve">ce jour le </w:t>
+        <w:t>ce jour le</w:t>
+      </w:r>
+      <w:proofErr w:type="gramStart"/>
+      <w:r>
+        <w:rPr>
+          <w:rFonts w:ascii="DIN" w:hAnsi="DIN"/>
+        </w:rPr>
+        <w:t xml:space="preserve"> </w:t>
       </w:r>
       <w:r>
         <w:rPr>
@@ -4901,6 +4036,7 @@
         </w:rPr>
         <w:t>../../….</w:t>
       </w:r>
+      <w:proofErr w:type="gramEnd"/>
       <w:r>
         <w:rPr>
           <w:rFonts w:ascii="DIN" w:hAnsi="DIN"/>
@@ -4975,6 +4111,7 @@
         </w:rPr>
         <w:t xml:space="preserve">om </w:t>
       </w:r>
+      <w:proofErr w:type="spellStart"/>
       <w:r>
         <w:rPr>
           <w:rFonts w:ascii="DIN" w:hAnsi="DIN"/>
@@ -4984,6 +4121,7 @@
         </w:rPr>
         <w:t>Date_debut_stage</w:t>
       </w:r>
+      <w:proofErr w:type="spellEnd"/>
       <w:r>
         <w:rPr>
           <w:rFonts w:ascii="DIN" w:hAnsi="DIN"/>
@@ -4993,6 +4131,7 @@
         </w:rPr>
         <w:t xml:space="preserve"> </w:t>
       </w:r>
+      <w:proofErr w:type="spellStart"/>
       <w:r>
         <w:rPr>
           <w:rFonts w:ascii="DIN" w:hAnsi="DIN"/>
@@ -5002,6 +4141,7 @@
         </w:rPr>
         <w:t>Date_fin_stage</w:t>
       </w:r>
+      <w:proofErr w:type="spellEnd"/>
       <w:r>
         <w:rPr>
           <w:rFonts w:ascii="DIN" w:hAnsi="DIN"/>
@@ -5036,7 +4176,17 @@
           <w:color w:val="365F91" w:themeColor="accent1" w:themeShade="BF"/>
           <w:lang w:val="en-US"/>
         </w:rPr>
-        <w:t xml:space="preserve">itively cease on this date </w:t>
+        <w:t>itively cease on this date</w:t>
+      </w:r>
+      <w:proofErr w:type="gramStart"/>
+      <w:r>
+        <w:rPr>
+          <w:rFonts w:ascii="DIN" w:hAnsi="DIN"/>
+          <w:i/>
+          <w:color w:val="365F91" w:themeColor="accent1" w:themeShade="BF"/>
+          <w:lang w:val="en-US"/>
+        </w:rPr>
+        <w:t xml:space="preserve"> </w:t>
       </w:r>
       <w:r>
         <w:rPr>
@@ -5045,7 +4195,27 @@
           <w:color w:val="365F91" w:themeColor="accent1" w:themeShade="BF"/>
           <w:lang w:val="en-US"/>
         </w:rPr>
-        <w:t>../../….</w:t>
+        <w:t>../..</w:t>
+      </w:r>
+      <w:proofErr w:type="gramEnd"/>
+      <w:r>
+        <w:rPr>
+          <w:rFonts w:ascii="DIN" w:hAnsi="DIN"/>
+          <w:i/>
+          <w:color w:val="365F91" w:themeColor="accent1" w:themeShade="BF"/>
+          <w:lang w:val="en-US"/>
+        </w:rPr>
+        <w:t>/</w:t>
+      </w:r>
+      <w:proofErr w:type="gramStart"/>
+      <w:r>
+        <w:rPr>
+          <w:rFonts w:ascii="DIN" w:hAnsi="DIN"/>
+          <w:i/>
+          <w:color w:val="365F91" w:themeColor="accent1" w:themeShade="BF"/>
+          <w:lang w:val="en-US"/>
+        </w:rPr>
+        <w:t>….</w:t>
       </w:r>
       <w:r>
         <w:rPr>
@@ -5056,6 +4226,7 @@
         </w:rPr>
         <w:t>.</w:t>
       </w:r>
+      <w:proofErr w:type="gramEnd"/>
     </w:p>
     <w:p>
       <w:pPr>
@@ -5100,7 +4271,20 @@
           <w:szCs w:val="18"/>
           <w:lang w:val="en-US"/>
         </w:rPr>
-        <w:t>Made at</w:t>
+        <w:t xml:space="preserve">Made </w:t>
+      </w:r>
+      <w:proofErr w:type="gramStart"/>
+      <w:r>
+        <w:rPr>
+          <w:rFonts w:ascii="DIN" w:hAnsi="DIN"/>
+          <w:b/>
+          <w:i/>
+          <w:color w:val="365F91" w:themeColor="accent1" w:themeShade="BF"/>
+          <w:sz w:val="18"/>
+          <w:szCs w:val="18"/>
+          <w:lang w:val="en-US"/>
+        </w:rPr>
+        <w:t>at</w:t>
       </w:r>
       <w:r>
         <w:rPr>
@@ -5123,6 +4307,7 @@
         </w:rPr>
         <w:t>:</w:t>
       </w:r>
+      <w:proofErr w:type="gramEnd"/>
       <w:r>
         <w:rPr>
           <w:rFonts w:ascii="DIN" w:hAnsi="DIN"/>
@@ -5131,8 +4316,20 @@
           <w:szCs w:val="18"/>
           <w:lang w:val="en-US"/>
         </w:rPr>
-        <w:t xml:space="preserve"> Meudon</w:t>
+        <w:t xml:space="preserve"> </w:t>
       </w:r>
+      <w:proofErr w:type="spellStart"/>
+      <w:r>
+        <w:rPr>
+          <w:rFonts w:ascii="DIN" w:hAnsi="DIN"/>
+          <w:b/>
+          <w:sz w:val="18"/>
+          <w:szCs w:val="18"/>
+          <w:lang w:val="en-US"/>
+        </w:rPr>
+        <w:t>Meudon</w:t>
+      </w:r>
+      <w:proofErr w:type="spellEnd"/>
     </w:p>
     <w:p>
       <w:pPr>
@@ -5250,8 +4447,20 @@
           <w:szCs w:val="18"/>
           <w:lang w:val="en-US"/>
         </w:rPr>
-        <w:t>*Le chef d’entreprise</w:t>
+        <w:t xml:space="preserve">*Le chef </w:t>
       </w:r>
+      <w:proofErr w:type="spellStart"/>
+      <w:r>
+        <w:rPr>
+          <w:rFonts w:ascii="DIN" w:hAnsi="DIN"/>
+          <w:b/>
+          <w:sz w:val="18"/>
+          <w:szCs w:val="18"/>
+          <w:lang w:val="en-US"/>
+        </w:rPr>
+        <w:t>d’entreprise</w:t>
+      </w:r>
+      <w:proofErr w:type="spellEnd"/>
       <w:r>
         <w:rPr>
           <w:rFonts w:ascii="DIN" w:hAnsi="DIN"/>
@@ -5474,7 +4683,7 @@
 <w:ftr xmlns:wpc="http://schemas.microsoft.com/office/word/2010/wordprocessingCanvas" xmlns:cx="http://schemas.microsoft.com/office/drawing/2014/chartex" xmlns:cx1="http://schemas.microsoft.com/office/drawing/2015/9/8/chartex" xmlns:cx2="http://schemas.microsoft.com/office/drawing/2015/10/21/chartex" xmlns:cx3="http://schemas.microsoft.com/office/drawing/2016/5/9/chartex" xmlns:cx4="http://schemas.microsoft.com/office/drawing/2016/5/10/chartex" xmlns:cx5="http://schemas.microsoft.com/office/drawing/2016/5/11/chartex" xmlns:cx6="http://schemas.microsoft.com/office/drawing/2016/5/12/chartex" xmlns:cx7="http://schemas.microsoft.com/office/drawing/2016/5/13/chartex" xmlns:cx8="http://schemas.microsoft.com/office/drawing/2016/5/14/chartex" xmlns:mc="http://schemas.openxmlformats.org/markup-compatibility/2006" xmlns:aink="http://schemas.microsoft.com/office/drawing/2016/ink" xmlns:am3d="http://schemas.microsoft.com/office/drawing/2017/model3d" xmlns:o="urn:schemas-microsoft-com:office:office" xmlns:oel="http://schemas.microsoft.com/office/2019/extlst" xmlns:r="http://schemas.openxmlformats.org/officeDocument/2006/relationships" xmlns:m="http://schemas.openxmlformats.org/officeDocument/2006/math" xmlns:v="urn:schemas-microsoft-com:vml" xmlns:wp14="http://schemas.microsoft.com/office/word/2010/wordprocessingDrawing" xmlns:wp="http://schemas.openxmlformats.org/drawingml/2006/wordprocessingDrawing" xmlns:w10="urn:schemas-microsoft-com:office:word" xmlns:w="http://schemas.openxmlformats.org/wordprocessingml/2006/main" xmlns:w14="http://schemas.microsoft.com/office/word/2010/wordml" xmlns:w15="http://schemas.microsoft.com/office/word/2012/wordml" xmlns:w16cex="http://schemas.microsoft.com/office/word/2018/wordml/cex" xmlns:w16cid="http://schemas.microsoft.com/office/word/2016/wordml/cid" xmlns:w16="http://schemas.microsoft.com/office/word/2018/wordml" xmlns:w16du="http://schemas.microsoft.com/office/word/2023/wordml/word16du" xmlns:w16sdtdh="http://schemas.microsoft.com/office/word/2020/wordml/sdtdatahash" xmlns:w16sdtfl="http://schemas.microsoft.com/office/word/2024/wordml/sdtformatlock" xmlns:w16se="http://schemas.microsoft.com/office/word/2015/wordml/symex" xmlns:wpg="http://schemas.microsoft.com/office/word/2010/wordprocessingGroup" xmlns:wpi="http://schemas.microsoft.com/office/word/2010/wordprocessingInk" xmlns:wne="http://schemas.microsoft.com/office/word/2006/wordml" xmlns:wps="http://schemas.microsoft.com/office/word/2010/wordprocessingShape" mc:Ignorable="w14 w15 w16se w16cid w16 w16cex w16sdtdh w16sdtfl w16du wp14">
   <w:p>
     <w:pPr>
-      <w:pStyle w:val="Footer"/>
+      <w:pStyle w:val="Pieddepage"/>
       <w:tabs>
         <w:tab w:val="clear" w:pos="9072"/>
         <w:tab w:val="center" w:pos="3402"/>
@@ -5685,7 +4894,7 @@
   </w:p>
   <w:p>
     <w:pPr>
-      <w:pStyle w:val="Footer"/>
+      <w:pStyle w:val="Pieddepage"/>
       <w:tabs>
         <w:tab w:val="clear" w:pos="9072"/>
         <w:tab w:val="center" w:pos="3402"/>
@@ -5734,7 +4943,7 @@
   </w:p>
   <w:p>
     <w:pPr>
-      <w:pStyle w:val="Footer"/>
+      <w:pStyle w:val="Pieddepage"/>
       <w:jc w:val="center"/>
       <w:rPr>
         <w:rFonts w:ascii="Verdana" w:hAnsi="Verdana"/>
@@ -5769,7 +4978,7 @@
   </w:p>
   <w:p>
     <w:pPr>
-      <w:pStyle w:val="Footer"/>
+      <w:pStyle w:val="Pieddepage"/>
       <w:spacing w:after="40"/>
       <w:jc w:val="center"/>
       <w:rPr>
@@ -5800,7 +5009,7 @@
 <w:ftr xmlns:wpc="http://schemas.microsoft.com/office/word/2010/wordprocessingCanvas" xmlns:cx="http://schemas.microsoft.com/office/drawing/2014/chartex" xmlns:cx1="http://schemas.microsoft.com/office/drawing/2015/9/8/chartex" xmlns:cx2="http://schemas.microsoft.com/office/drawing/2015/10/21/chartex" xmlns:cx3="http://schemas.microsoft.com/office/drawing/2016/5/9/chartex" xmlns:cx4="http://schemas.microsoft.com/office/drawing/2016/5/10/chartex" xmlns:cx5="http://schemas.microsoft.com/office/drawing/2016/5/11/chartex" xmlns:cx6="http://schemas.microsoft.com/office/drawing/2016/5/12/chartex" xmlns:cx7="http://schemas.microsoft.com/office/drawing/2016/5/13/chartex" xmlns:cx8="http://schemas.microsoft.com/office/drawing/2016/5/14/chartex" xmlns:mc="http://schemas.openxmlformats.org/markup-compatibility/2006" xmlns:aink="http://schemas.microsoft.com/office/drawing/2016/ink" xmlns:am3d="http://schemas.microsoft.com/office/drawing/2017/model3d" xmlns:o="urn:schemas-microsoft-com:office:office" xmlns:oel="http://schemas.microsoft.com/office/2019/extlst" xmlns:r="http://schemas.openxmlformats.org/officeDocument/2006/relationships" xmlns:m="http://schemas.openxmlformats.org/officeDocument/2006/math" xmlns:v="urn:schemas-microsoft-com:vml" xmlns:wp14="http://schemas.microsoft.com/office/word/2010/wordprocessingDrawing" xmlns:wp="http://schemas.openxmlformats.org/drawingml/2006/wordprocessingDrawing" xmlns:w10="urn:schemas-microsoft-com:office:word" xmlns:w="http://schemas.openxmlformats.org/wordprocessingml/2006/main" xmlns:w14="http://schemas.microsoft.com/office/word/2010/wordml" xmlns:w15="http://schemas.microsoft.com/office/word/2012/wordml" xmlns:w16cex="http://schemas.microsoft.com/office/word/2018/wordml/cex" xmlns:w16cid="http://schemas.microsoft.com/office/word/2016/wordml/cid" xmlns:w16="http://schemas.microsoft.com/office/word/2018/wordml" xmlns:w16du="http://schemas.microsoft.com/office/word/2023/wordml/word16du" xmlns:w16sdtdh="http://schemas.microsoft.com/office/word/2020/wordml/sdtdatahash" xmlns:w16sdtfl="http://schemas.microsoft.com/office/word/2024/wordml/sdtformatlock" xmlns:w16se="http://schemas.microsoft.com/office/word/2015/wordml/symex" xmlns:wpg="http://schemas.microsoft.com/office/word/2010/wordprocessingGroup" xmlns:wpi="http://schemas.microsoft.com/office/word/2010/wordprocessingInk" xmlns:wne="http://schemas.microsoft.com/office/word/2006/wordml" xmlns:wps="http://schemas.microsoft.com/office/word/2010/wordprocessingShape" mc:Ignorable="w14 w15 w16se w16cid w16 w16cex w16sdtdh w16sdtfl w16du wp14">
   <w:p>
     <w:pPr>
-      <w:pStyle w:val="Footer"/>
+      <w:pStyle w:val="Pieddepage"/>
       <w:spacing w:after="40"/>
       <w:jc w:val="center"/>
       <w:rPr>
@@ -5926,7 +5135,7 @@
 <w:ftr xmlns:wpc="http://schemas.microsoft.com/office/word/2010/wordprocessingCanvas" xmlns:cx="http://schemas.microsoft.com/office/drawing/2014/chartex" xmlns:cx1="http://schemas.microsoft.com/office/drawing/2015/9/8/chartex" xmlns:cx2="http://schemas.microsoft.com/office/drawing/2015/10/21/chartex" xmlns:cx3="http://schemas.microsoft.com/office/drawing/2016/5/9/chartex" xmlns:cx4="http://schemas.microsoft.com/office/drawing/2016/5/10/chartex" xmlns:cx5="http://schemas.microsoft.com/office/drawing/2016/5/11/chartex" xmlns:cx6="http://schemas.microsoft.com/office/drawing/2016/5/12/chartex" xmlns:cx7="http://schemas.microsoft.com/office/drawing/2016/5/13/chartex" xmlns:cx8="http://schemas.microsoft.com/office/drawing/2016/5/14/chartex" xmlns:mc="http://schemas.openxmlformats.org/markup-compatibility/2006" xmlns:aink="http://schemas.microsoft.com/office/drawing/2016/ink" xmlns:am3d="http://schemas.microsoft.com/office/drawing/2017/model3d" xmlns:o="urn:schemas-microsoft-com:office:office" xmlns:oel="http://schemas.microsoft.com/office/2019/extlst" xmlns:r="http://schemas.openxmlformats.org/officeDocument/2006/relationships" xmlns:m="http://schemas.openxmlformats.org/officeDocument/2006/math" xmlns:v="urn:schemas-microsoft-com:vml" xmlns:wp14="http://schemas.microsoft.com/office/word/2010/wordprocessingDrawing" xmlns:wp="http://schemas.openxmlformats.org/drawingml/2006/wordprocessingDrawing" xmlns:w10="urn:schemas-microsoft-com:office:word" xmlns:w="http://schemas.openxmlformats.org/wordprocessingml/2006/main" xmlns:w14="http://schemas.microsoft.com/office/word/2010/wordml" xmlns:w15="http://schemas.microsoft.com/office/word/2012/wordml" xmlns:w16cex="http://schemas.microsoft.com/office/word/2018/wordml/cex" xmlns:w16cid="http://schemas.microsoft.com/office/word/2016/wordml/cid" xmlns:w16="http://schemas.microsoft.com/office/word/2018/wordml" xmlns:w16du="http://schemas.microsoft.com/office/word/2023/wordml/word16du" xmlns:w16sdtdh="http://schemas.microsoft.com/office/word/2020/wordml/sdtdatahash" xmlns:w16sdtfl="http://schemas.microsoft.com/office/word/2024/wordml/sdtformatlock" xmlns:w16se="http://schemas.microsoft.com/office/word/2015/wordml/symex" xmlns:wpg="http://schemas.microsoft.com/office/word/2010/wordprocessingGroup" xmlns:wpi="http://schemas.microsoft.com/office/word/2010/wordprocessingInk" xmlns:wne="http://schemas.microsoft.com/office/word/2006/wordml" xmlns:wps="http://schemas.microsoft.com/office/word/2010/wordprocessingShape" mc:Ignorable="w14 w15 w16se w16cid w16 w16cex w16sdtdh w16sdtfl w16du wp14">
   <w:p>
     <w:pPr>
-      <w:pStyle w:val="Footer"/>
+      <w:pStyle w:val="Pieddepage"/>
     </w:pPr>
     <w:r>
       <w:rPr>
@@ -6065,47 +5274,47 @@
 <w:hdr xmlns:wpc="http://schemas.microsoft.com/office/word/2010/wordprocessingCanvas" xmlns:cx="http://schemas.microsoft.com/office/drawing/2014/chartex" xmlns:cx1="http://schemas.microsoft.com/office/drawing/2015/9/8/chartex" xmlns:cx2="http://schemas.microsoft.com/office/drawing/2015/10/21/chartex" xmlns:cx3="http://schemas.microsoft.com/office/drawing/2016/5/9/chartex" xmlns:cx4="http://schemas.microsoft.com/office/drawing/2016/5/10/chartex" xmlns:cx5="http://schemas.microsoft.com/office/drawing/2016/5/11/chartex" xmlns:cx6="http://schemas.microsoft.com/office/drawing/2016/5/12/chartex" xmlns:cx7="http://schemas.microsoft.com/office/drawing/2016/5/13/chartex" xmlns:cx8="http://schemas.microsoft.com/office/drawing/2016/5/14/chartex" xmlns:mc="http://schemas.openxmlformats.org/markup-compatibility/2006" xmlns:aink="http://schemas.microsoft.com/office/drawing/2016/ink" xmlns:am3d="http://schemas.microsoft.com/office/drawing/2017/model3d" xmlns:o="urn:schemas-microsoft-com:office:office" xmlns:oel="http://schemas.microsoft.com/office/2019/extlst" xmlns:r="http://schemas.openxmlformats.org/officeDocument/2006/relationships" xmlns:m="http://schemas.openxmlformats.org/officeDocument/2006/math" xmlns:v="urn:schemas-microsoft-com:vml" xmlns:wp14="http://schemas.microsoft.com/office/word/2010/wordprocessingDrawing" xmlns:wp="http://schemas.openxmlformats.org/drawingml/2006/wordprocessingDrawing" xmlns:w10="urn:schemas-microsoft-com:office:word" xmlns:w="http://schemas.openxmlformats.org/wordprocessingml/2006/main" xmlns:w14="http://schemas.microsoft.com/office/word/2010/wordml" xmlns:w15="http://schemas.microsoft.com/office/word/2012/wordml" xmlns:w16cex="http://schemas.microsoft.com/office/word/2018/wordml/cex" xmlns:w16cid="http://schemas.microsoft.com/office/word/2016/wordml/cid" xmlns:w16="http://schemas.microsoft.com/office/word/2018/wordml" xmlns:w16du="http://schemas.microsoft.com/office/word/2023/wordml/word16du" xmlns:w16sdtdh="http://schemas.microsoft.com/office/word/2020/wordml/sdtdatahash" xmlns:w16sdtfl="http://schemas.microsoft.com/office/word/2024/wordml/sdtformatlock" xmlns:w16se="http://schemas.microsoft.com/office/word/2015/wordml/symex" xmlns:wpg="http://schemas.microsoft.com/office/word/2010/wordprocessingGroup" xmlns:wpi="http://schemas.microsoft.com/office/word/2010/wordprocessingInk" xmlns:wne="http://schemas.microsoft.com/office/word/2006/wordml" xmlns:wps="http://schemas.microsoft.com/office/word/2010/wordprocessingShape" mc:Ignorable="w14 w15 w16se w16cid w16 w16cex w16sdtdh w16sdtfl w16du wp14">
   <w:p>
     <w:pPr>
-      <w:pStyle w:val="Header"/>
+      <w:pStyle w:val="En-tte"/>
       <w:framePr w:wrap="around" w:vAnchor="text" w:hAnchor="margin" w:xAlign="right" w:y="1"/>
       <w:rPr>
-        <w:rStyle w:val="PageNumber"/>
+        <w:rStyle w:val="Numrodepage"/>
       </w:rPr>
     </w:pPr>
     <w:r>
       <w:rPr>
-        <w:rStyle w:val="PageNumber"/>
+        <w:rStyle w:val="Numrodepage"/>
       </w:rPr>
       <w:fldChar w:fldCharType="begin"/>
     </w:r>
     <w:r>
       <w:rPr>
-        <w:rStyle w:val="PageNumber"/>
+        <w:rStyle w:val="Numrodepage"/>
       </w:rPr>
       <w:instrText xml:space="preserve">PAGE  </w:instrText>
     </w:r>
     <w:r>
       <w:rPr>
-        <w:rStyle w:val="PageNumber"/>
+        <w:rStyle w:val="Numrodepage"/>
       </w:rPr>
       <w:fldChar w:fldCharType="separate"/>
     </w:r>
     <w:r>
       <w:rPr>
-        <w:rStyle w:val="PageNumber"/>
+        <w:rStyle w:val="Numrodepage"/>
         <w:noProof/>
       </w:rPr>
       <w:t>2</w:t>
     </w:r>
     <w:r>
       <w:rPr>
-        <w:rStyle w:val="PageNumber"/>
+        <w:rStyle w:val="Numrodepage"/>
       </w:rPr>
       <w:fldChar w:fldCharType="end"/>
     </w:r>
   </w:p>
   <w:p>
     <w:pPr>
-      <w:pStyle w:val="Header"/>
+      <w:pStyle w:val="En-tte"/>
       <w:ind w:right="360"/>
       <w:jc w:val="center"/>
     </w:pPr>
@@ -6117,7 +5326,7 @@
 <w:hdr xmlns:wpc="http://schemas.microsoft.com/office/word/2010/wordprocessingCanvas" xmlns:cx="http://schemas.microsoft.com/office/drawing/2014/chartex" xmlns:cx1="http://schemas.microsoft.com/office/drawing/2015/9/8/chartex" xmlns:cx2="http://schemas.microsoft.com/office/drawing/2015/10/21/chartex" xmlns:cx3="http://schemas.microsoft.com/office/drawing/2016/5/9/chartex" xmlns:cx4="http://schemas.microsoft.com/office/drawing/2016/5/10/chartex" xmlns:cx5="http://schemas.microsoft.com/office/drawing/2016/5/11/chartex" xmlns:cx6="http://schemas.microsoft.com/office/drawing/2016/5/12/chartex" xmlns:cx7="http://schemas.microsoft.com/office/drawing/2016/5/13/chartex" xmlns:cx8="http://schemas.microsoft.com/office/drawing/2016/5/14/chartex" xmlns:mc="http://schemas.openxmlformats.org/markup-compatibility/2006" xmlns:aink="http://schemas.microsoft.com/office/drawing/2016/ink" xmlns:am3d="http://schemas.microsoft.com/office/drawing/2017/model3d" xmlns:o="urn:schemas-microsoft-com:office:office" xmlns:oel="http://schemas.microsoft.com/office/2019/extlst" xmlns:r="http://schemas.openxmlformats.org/officeDocument/2006/relationships" xmlns:m="http://schemas.openxmlformats.org/officeDocument/2006/math" xmlns:v="urn:schemas-microsoft-com:vml" xmlns:wp14="http://schemas.microsoft.com/office/word/2010/wordprocessingDrawing" xmlns:wp="http://schemas.openxmlformats.org/drawingml/2006/wordprocessingDrawing" xmlns:w10="urn:schemas-microsoft-com:office:word" xmlns:w="http://schemas.openxmlformats.org/wordprocessingml/2006/main" xmlns:w14="http://schemas.microsoft.com/office/word/2010/wordml" xmlns:w15="http://schemas.microsoft.com/office/word/2012/wordml" xmlns:w16cex="http://schemas.microsoft.com/office/word/2018/wordml/cex" xmlns:w16cid="http://schemas.microsoft.com/office/word/2016/wordml/cid" xmlns:w16="http://schemas.microsoft.com/office/word/2018/wordml" xmlns:w16du="http://schemas.microsoft.com/office/word/2023/wordml/word16du" xmlns:w16sdtdh="http://schemas.microsoft.com/office/word/2020/wordml/sdtdatahash" xmlns:w16sdtfl="http://schemas.microsoft.com/office/word/2024/wordml/sdtformatlock" xmlns:w16se="http://schemas.microsoft.com/office/word/2015/wordml/symex" xmlns:wpg="http://schemas.microsoft.com/office/word/2010/wordprocessingGroup" xmlns:wpi="http://schemas.microsoft.com/office/word/2010/wordprocessingInk" xmlns:wne="http://schemas.microsoft.com/office/word/2006/wordml" xmlns:wps="http://schemas.microsoft.com/office/word/2010/wordprocessingShape" mc:Ignorable="w14 w15 w16se w16cid w16 w16cex w16sdtdh w16sdtfl w16du wp14">
   <w:p>
     <w:pPr>
-      <w:pStyle w:val="Header"/>
+      <w:pStyle w:val="En-tte"/>
       <w:ind w:right="360"/>
       <w:jc w:val="center"/>
     </w:pPr>
@@ -6177,14 +5386,14 @@
   </w:p>
   <w:p>
     <w:pPr>
-      <w:pStyle w:val="Header"/>
+      <w:pStyle w:val="En-tte"/>
       <w:ind w:right="360"/>
       <w:jc w:val="center"/>
     </w:pPr>
   </w:p>
   <w:p>
     <w:pPr>
-      <w:pStyle w:val="Header"/>
+      <w:pStyle w:val="En-tte"/>
       <w:ind w:right="360"/>
       <w:jc w:val="center"/>
     </w:pPr>
@@ -7484,11 +6693,11 @@
     <w:name w:val="Normal"/>
     <w:qFormat/>
   </w:style>
-  <w:style w:type="paragraph" w:styleId="Heading2">
+  <w:style w:type="paragraph" w:styleId="Titre2">
     <w:name w:val="heading 2"/>
     <w:basedOn w:val="Normal"/>
     <w:next w:val="Normal"/>
-    <w:link w:val="Heading2Char"/>
+    <w:link w:val="Titre2Car"/>
     <w:qFormat/>
     <w:rsid w:val="0063316B"/>
     <w:pPr>
@@ -7503,11 +6712,11 @@
       <w:szCs w:val="16"/>
     </w:rPr>
   </w:style>
-  <w:style w:type="paragraph" w:styleId="Heading8">
+  <w:style w:type="paragraph" w:styleId="Titre8">
     <w:name w:val="heading 8"/>
     <w:basedOn w:val="Normal"/>
     <w:next w:val="Normal"/>
-    <w:link w:val="Heading8Char"/>
+    <w:link w:val="Titre8Car"/>
     <w:qFormat/>
     <w:rsid w:val="0063316B"/>
     <w:pPr>
@@ -7522,13 +6731,13 @@
       <w:szCs w:val="18"/>
     </w:rPr>
   </w:style>
-  <w:style w:type="character" w:default="1" w:styleId="DefaultParagraphFont">
+  <w:style w:type="character" w:default="1" w:styleId="Policepardfaut">
     <w:name w:val="Default Paragraph Font"/>
     <w:uiPriority w:val="1"/>
     <w:semiHidden/>
     <w:unhideWhenUsed/>
   </w:style>
-  <w:style w:type="table" w:default="1" w:styleId="TableNormal">
+  <w:style w:type="table" w:default="1" w:styleId="TableauNormal">
     <w:name w:val="Normal Table"/>
     <w:uiPriority w:val="99"/>
     <w:semiHidden/>
@@ -7543,13 +6752,13 @@
       </w:tblCellMar>
     </w:tblPr>
   </w:style>
-  <w:style w:type="numbering" w:default="1" w:styleId="NoList">
+  <w:style w:type="numbering" w:default="1" w:styleId="Aucuneliste">
     <w:name w:val="No List"/>
     <w:uiPriority w:val="99"/>
     <w:semiHidden/>
     <w:unhideWhenUsed/>
   </w:style>
-  <w:style w:type="paragraph" w:styleId="Header">
+  <w:style w:type="paragraph" w:styleId="En-tte">
     <w:name w:val="header"/>
     <w:basedOn w:val="Normal"/>
     <w:pPr>
@@ -7559,11 +6768,11 @@
       </w:tabs>
     </w:pPr>
   </w:style>
-  <w:style w:type="character" w:styleId="PageNumber">
+  <w:style w:type="character" w:styleId="Numrodepage">
     <w:name w:val="page number"/>
-    <w:basedOn w:val="DefaultParagraphFont"/>
+    <w:basedOn w:val="Policepardfaut"/>
   </w:style>
-  <w:style w:type="character" w:styleId="Hyperlink">
+  <w:style w:type="character" w:styleId="Lienhypertexte">
     <w:name w:val="Hyperlink"/>
     <w:rsid w:val="00A338BF"/>
     <w:rPr>
@@ -7571,7 +6780,7 @@
       <w:u w:val="single"/>
     </w:rPr>
   </w:style>
-  <w:style w:type="paragraph" w:styleId="BalloonText">
+  <w:style w:type="paragraph" w:styleId="Textedebulles">
     <w:name w:val="Balloon Text"/>
     <w:basedOn w:val="Normal"/>
     <w:semiHidden/>
@@ -7582,10 +6791,10 @@
       <w:szCs w:val="16"/>
     </w:rPr>
   </w:style>
-  <w:style w:type="paragraph" w:styleId="Footer">
+  <w:style w:type="paragraph" w:styleId="Pieddepage">
     <w:name w:val="footer"/>
     <w:basedOn w:val="Normal"/>
-    <w:link w:val="FooterChar"/>
+    <w:link w:val="PieddepageCar"/>
     <w:rsid w:val="007248E1"/>
     <w:pPr>
       <w:tabs>
@@ -7594,14 +6803,14 @@
       </w:tabs>
     </w:pPr>
   </w:style>
-  <w:style w:type="character" w:customStyle="1" w:styleId="FooterChar">
-    <w:name w:val="Footer Char"/>
-    <w:basedOn w:val="DefaultParagraphFont"/>
-    <w:link w:val="Footer"/>
+  <w:style w:type="character" w:customStyle="1" w:styleId="PieddepageCar">
+    <w:name w:val="Pied de page Car"/>
+    <w:basedOn w:val="Policepardfaut"/>
+    <w:link w:val="Pieddepage"/>
     <w:uiPriority w:val="99"/>
     <w:rsid w:val="007248E1"/>
   </w:style>
-  <w:style w:type="paragraph" w:styleId="ListParagraph">
+  <w:style w:type="paragraph" w:styleId="Paragraphedeliste">
     <w:name w:val="List Paragraph"/>
     <w:basedOn w:val="Normal"/>
     <w:uiPriority w:val="34"/>
@@ -7611,9 +6820,9 @@
       <w:ind w:left="708"/>
     </w:pPr>
   </w:style>
-  <w:style w:type="character" w:styleId="Strong">
+  <w:style w:type="character" w:styleId="lev">
     <w:name w:val="Strong"/>
-    <w:basedOn w:val="DefaultParagraphFont"/>
+    <w:basedOn w:val="Policepardfaut"/>
     <w:uiPriority w:val="22"/>
     <w:qFormat/>
     <w:rsid w:val="00A46404"/>
@@ -7622,10 +6831,10 @@
       <w:bCs/>
     </w:rPr>
   </w:style>
-  <w:style w:type="paragraph" w:styleId="BodyTextIndent">
+  <w:style w:type="paragraph" w:styleId="Retraitcorpsdetexte">
     <w:name w:val="Body Text Indent"/>
     <w:basedOn w:val="Normal"/>
-    <w:link w:val="BodyTextIndentChar"/>
+    <w:link w:val="RetraitcorpsdetexteCar"/>
     <w:rsid w:val="00BF16B2"/>
     <w:pPr>
       <w:spacing w:before="240"/>
@@ -7637,10 +6846,10 @@
       <w:szCs w:val="18"/>
     </w:rPr>
   </w:style>
-  <w:style w:type="character" w:customStyle="1" w:styleId="BodyTextIndentChar">
-    <w:name w:val="Body Text Indent Char"/>
-    <w:basedOn w:val="DefaultParagraphFont"/>
-    <w:link w:val="BodyTextIndent"/>
+  <w:style w:type="character" w:customStyle="1" w:styleId="RetraitcorpsdetexteCar">
+    <w:name w:val="Retrait corps de texte Car"/>
+    <w:basedOn w:val="Policepardfaut"/>
+    <w:link w:val="Retraitcorpsdetexte"/>
     <w:rsid w:val="00BF16B2"/>
     <w:rPr>
       <w:b/>
@@ -7649,40 +6858,40 @@
       <w:szCs w:val="18"/>
     </w:rPr>
   </w:style>
-  <w:style w:type="paragraph" w:styleId="BodyText">
+  <w:style w:type="paragraph" w:styleId="Corpsdetexte">
     <w:name w:val="Body Text"/>
     <w:basedOn w:val="Normal"/>
-    <w:link w:val="BodyTextChar"/>
+    <w:link w:val="CorpsdetexteCar"/>
     <w:rsid w:val="00BF16B2"/>
     <w:pPr>
       <w:spacing w:after="120"/>
     </w:pPr>
   </w:style>
-  <w:style w:type="character" w:customStyle="1" w:styleId="BodyTextChar">
-    <w:name w:val="Body Text Char"/>
-    <w:basedOn w:val="DefaultParagraphFont"/>
-    <w:link w:val="BodyText"/>
+  <w:style w:type="character" w:customStyle="1" w:styleId="CorpsdetexteCar">
+    <w:name w:val="Corps de texte Car"/>
+    <w:basedOn w:val="Policepardfaut"/>
+    <w:link w:val="Corpsdetexte"/>
     <w:rsid w:val="00BF16B2"/>
   </w:style>
-  <w:style w:type="paragraph" w:styleId="BodyText2">
+  <w:style w:type="paragraph" w:styleId="Corpsdetexte2">
     <w:name w:val="Body Text 2"/>
     <w:basedOn w:val="Normal"/>
-    <w:link w:val="BodyText2Char"/>
+    <w:link w:val="Corpsdetexte2Car"/>
     <w:rsid w:val="00BF16B2"/>
     <w:pPr>
       <w:spacing w:after="120" w:line="480" w:lineRule="auto"/>
     </w:pPr>
   </w:style>
-  <w:style w:type="character" w:customStyle="1" w:styleId="BodyText2Char">
-    <w:name w:val="Body Text 2 Char"/>
-    <w:basedOn w:val="DefaultParagraphFont"/>
-    <w:link w:val="BodyText2"/>
+  <w:style w:type="character" w:customStyle="1" w:styleId="Corpsdetexte2Car">
+    <w:name w:val="Corps de texte 2 Car"/>
+    <w:basedOn w:val="Policepardfaut"/>
+    <w:link w:val="Corpsdetexte2"/>
     <w:rsid w:val="00BF16B2"/>
   </w:style>
-  <w:style w:type="character" w:customStyle="1" w:styleId="Heading2Char">
-    <w:name w:val="Heading 2 Char"/>
-    <w:basedOn w:val="DefaultParagraphFont"/>
-    <w:link w:val="Heading2"/>
+  <w:style w:type="character" w:customStyle="1" w:styleId="Titre2Car">
+    <w:name w:val="Titre 2 Car"/>
+    <w:basedOn w:val="Policepardfaut"/>
+    <w:link w:val="Titre2"/>
     <w:rsid w:val="0063316B"/>
     <w:rPr>
       <w:b/>
@@ -7691,10 +6900,10 @@
       <w:szCs w:val="16"/>
     </w:rPr>
   </w:style>
-  <w:style w:type="character" w:customStyle="1" w:styleId="Heading8Char">
-    <w:name w:val="Heading 8 Char"/>
-    <w:basedOn w:val="DefaultParagraphFont"/>
-    <w:link w:val="Heading8"/>
+  <w:style w:type="character" w:customStyle="1" w:styleId="Titre8Car">
+    <w:name w:val="Titre 8 Car"/>
+    <w:basedOn w:val="Policepardfaut"/>
+    <w:link w:val="Titre8"/>
     <w:rsid w:val="0063316B"/>
     <w:rPr>
       <w:b/>
@@ -7703,10 +6912,10 @@
       <w:szCs w:val="18"/>
     </w:rPr>
   </w:style>
-  <w:style w:type="paragraph" w:styleId="BodyText3">
+  <w:style w:type="paragraph" w:styleId="Corpsdetexte3">
     <w:name w:val="Body Text 3"/>
     <w:basedOn w:val="Normal"/>
-    <w:link w:val="BodyText3Char"/>
+    <w:link w:val="Corpsdetexte3Car"/>
     <w:rsid w:val="00CC726A"/>
     <w:pPr>
       <w:spacing w:after="120"/>
@@ -7716,19 +6925,19 @@
       <w:szCs w:val="16"/>
     </w:rPr>
   </w:style>
-  <w:style w:type="character" w:customStyle="1" w:styleId="BodyText3Char">
-    <w:name w:val="Body Text 3 Char"/>
-    <w:basedOn w:val="DefaultParagraphFont"/>
-    <w:link w:val="BodyText3"/>
+  <w:style w:type="character" w:customStyle="1" w:styleId="Corpsdetexte3Car">
+    <w:name w:val="Corps de texte 3 Car"/>
+    <w:basedOn w:val="Policepardfaut"/>
+    <w:link w:val="Corpsdetexte3"/>
     <w:rsid w:val="00CC726A"/>
     <w:rPr>
       <w:sz w:val="16"/>
       <w:szCs w:val="16"/>
     </w:rPr>
   </w:style>
-  <w:style w:type="character" w:styleId="PlaceholderText">
+  <w:style w:type="character" w:styleId="Textedelespacerserv">
     <w:name w:val="Placeholder Text"/>
-    <w:basedOn w:val="DefaultParagraphFont"/>
+    <w:basedOn w:val="Policepardfaut"/>
     <w:uiPriority w:val="99"/>
     <w:semiHidden/>
     <w:rsid w:val="00364998"/>
@@ -7736,9 +6945,9 @@
       <w:color w:val="808080"/>
     </w:rPr>
   </w:style>
-  <w:style w:type="table" w:styleId="TableGrid">
+  <w:style w:type="table" w:styleId="Grilledutableau">
     <w:name w:val="Table Grid"/>
-    <w:basedOn w:val="TableNormal"/>
+    <w:basedOn w:val="TableauNormal"/>
     <w:rsid w:val="007007CB"/>
     <w:tblPr>
       <w:tblBorders>
@@ -7779,7 +6988,7 @@
           </w:pPr>
           <w:r>
             <w:rPr>
-              <w:rStyle w:val="PlaceholderText"/>
+              <w:rStyle w:val="Textedelespacerserv"/>
             </w:rPr>
             <w:t>Cliquez ou appuyez ici pour entrer du texte.</w:t>
           </w:r>
@@ -7808,7 +7017,7 @@
           </w:pPr>
           <w:r>
             <w:rPr>
-              <w:rStyle w:val="PlaceholderText"/>
+              <w:rStyle w:val="Textedelespacerserv"/>
             </w:rPr>
             <w:t>Cliquez ou appuyez ici pour entrer du texte.</w:t>
           </w:r>
@@ -7837,15 +7046,15 @@
   </w:font>
   <w:font w:name="Wingdings">
     <w:panose1 w:val="05000000000000000000"/>
-    <w:charset w:val="02"/>
-    <w:family w:val="auto"/>
+    <w:charset w:val="4D"/>
+    <w:family w:val="decorative"/>
     <w:pitch w:val="variable"/>
-    <w:sig w:usb0="00000000" w:usb1="10000000" w:usb2="00000000" w:usb3="00000000" w:csb0="80000000" w:csb1="00000000"/>
+    <w:sig w:usb0="00000003" w:usb1="00000000" w:usb2="00000000" w:usb3="00000000" w:csb0="80000001" w:csb1="00000000"/>
   </w:font>
   <w:font w:name="Symbol">
     <w:panose1 w:val="05050102010706020507"/>
     <w:charset w:val="02"/>
-    <w:family w:val="roman"/>
+    <w:family w:val="decorative"/>
     <w:pitch w:val="variable"/>
     <w:sig w:usb0="00000000" w:usb1="10000000" w:usb2="00000000" w:usb3="00000000" w:csb0="80000000" w:csb1="00000000"/>
   </w:font>
@@ -7865,6 +7074,7 @@
   </w:font>
   <w:font w:name="DIN">
     <w:altName w:val="Cambria"/>
+    <w:panose1 w:val="020B0604020202020204"/>
     <w:charset w:val="00"/>
     <w:family w:val="auto"/>
     <w:pitch w:val="variable"/>
@@ -7872,12 +7082,15 @@
   </w:font>
   <w:font w:name="DIN Pro Regular">
     <w:altName w:val="Calibri"/>
+    <w:panose1 w:val="020B0604020202020204"/>
     <w:charset w:val="00"/>
     <w:family w:val="swiss"/>
     <w:pitch w:val="variable"/>
     <w:sig w:usb0="A00002BF" w:usb1="4000207B" w:usb2="00000008" w:usb3="00000000" w:csb0="0000009F" w:csb1="00000000"/>
   </w:font>
   <w:font w:name="Domaine Sans Text Ducasse Light">
+    <w:altName w:val="Calibri"/>
+    <w:panose1 w:val="020B0604020202020204"/>
     <w:charset w:val="00"/>
     <w:family w:val="swiss"/>
     <w:pitch w:val="variable"/>
@@ -7888,28 +7101,29 @@
     <w:charset w:val="00"/>
     <w:family w:val="swiss"/>
     <w:pitch w:val="variable"/>
-    <w:sig w:usb0="A00006FF" w:usb1="4000205B" w:usb2="00000010" w:usb3="00000000" w:csb0="0000019F" w:csb1="00000000"/>
+    <w:sig w:usb0="A10006FF" w:usb1="4000205B" w:usb2="00000010" w:usb3="00000000" w:csb0="0000019F" w:csb1="00000000"/>
   </w:font>
   <w:font w:name="Cambria">
     <w:panose1 w:val="02040503050406030204"/>
     <w:charset w:val="00"/>
     <w:family w:val="roman"/>
     <w:pitch w:val="variable"/>
-    <w:sig w:usb0="E00006FF" w:usb1="420024FF" w:usb2="02000000" w:usb3="00000000" w:csb0="0000019F" w:csb1="00000000"/>
+    <w:sig w:usb0="E00002FF" w:usb1="400004FF" w:usb2="00000000" w:usb3="00000000" w:csb0="0000019F" w:csb1="00000000"/>
   </w:font>
   <w:font w:name="Aptos">
-    <w:panose1 w:val="00000000000000000000"/>
+    <w:panose1 w:val="020B0004020202020204"/>
     <w:charset w:val="00"/>
-    <w:family w:val="roman"/>
-    <w:notTrueType/>
-    <w:pitch w:val="default"/>
+    <w:family w:val="swiss"/>
+    <w:pitch w:val="variable"/>
+    <w:sig w:usb0="20000287" w:usb1="00000003" w:usb2="00000000" w:usb3="00000000" w:csb0="0000019F" w:csb1="00000000"/>
   </w:font>
   <w:font w:name="Aptos Display">
-    <w:panose1 w:val="00000000000000000000"/>
+    <w:panose1 w:val="020B0004020202020204"/>
     <w:charset w:val="00"/>
-    <w:family w:val="roman"/>
+    <w:family w:val="swiss"/>
     <w:notTrueType/>
-    <w:pitch w:val="default"/>
+    <w:pitch w:val="variable"/>
+    <w:sig w:usb0="20000287" w:usb1="00000003" w:usb2="00000000" w:usb3="00000000" w:csb0="0000019F" w:csb1="00000000"/>
   </w:font>
 </w:fonts>
 </file>
@@ -7940,6 +7154,7 @@
     <w:rsid w:val="005B4018"/>
     <w:rsid w:val="005D355A"/>
     <w:rsid w:val="00617AE3"/>
+    <w:rsid w:val="006F0A02"/>
     <w:rsid w:val="00863319"/>
     <w:rsid w:val="008A2756"/>
     <w:rsid w:val="008A30B9"/>
@@ -7952,6 +7167,7 @@
     <w:rsid w:val="00AF43D3"/>
     <w:rsid w:val="00B62C10"/>
     <w:rsid w:val="00B83D96"/>
+    <w:rsid w:val="00C25C57"/>
     <w:rsid w:val="00C61434"/>
     <w:rsid w:val="00C75CF6"/>
     <w:rsid w:val="00E2776A"/>
@@ -7974,8 +7190,8 @@
   </m:mathPr>
   <w:themeFontLang w:val="fr-FR"/>
   <w:clrSchemeMapping w:bg1="light1" w:t1="dark1" w:bg2="light2" w:t2="dark2" w:accent1="accent1" w:accent2="accent2" w:accent3="accent3" w:accent4="accent4" w:accent5="accent5" w:accent6="accent6" w:hyperlink="hyperlink" w:followedHyperlink="followedHyperlink"/>
-  <w:decimalSymbol w:val="."/>
-  <w:listSeparator w:val=","/>
+  <w:decimalSymbol w:val=","/>
+  <w:listSeparator w:val=";"/>
 </w:settings>
 </file>
 
@@ -8378,13 +7594,13 @@
     <w:name w:val="Normal"/>
     <w:qFormat/>
   </w:style>
-  <w:style w:type="character" w:default="1" w:styleId="DefaultParagraphFont">
+  <w:style w:type="character" w:default="1" w:styleId="Policepardfaut">
     <w:name w:val="Default Paragraph Font"/>
     <w:uiPriority w:val="1"/>
     <w:semiHidden/>
     <w:unhideWhenUsed/>
   </w:style>
-  <w:style w:type="table" w:default="1" w:styleId="TableNormal">
+  <w:style w:type="table" w:default="1" w:styleId="TableauNormal">
     <w:name w:val="Normal Table"/>
     <w:uiPriority w:val="99"/>
     <w:semiHidden/>
@@ -8399,15 +7615,15 @@
       </w:tblCellMar>
     </w:tblPr>
   </w:style>
-  <w:style w:type="numbering" w:default="1" w:styleId="NoList">
+  <w:style w:type="numbering" w:default="1" w:styleId="Aucuneliste">
     <w:name w:val="No List"/>
     <w:uiPriority w:val="99"/>
     <w:semiHidden/>
     <w:unhideWhenUsed/>
   </w:style>
-  <w:style w:type="character" w:styleId="PlaceholderText">
+  <w:style w:type="character" w:styleId="Textedelespacerserv">
     <w:name w:val="Placeholder Text"/>
-    <w:basedOn w:val="DefaultParagraphFont"/>
+    <w:basedOn w:val="Policepardfaut"/>
     <w:uiPriority w:val="99"/>
     <w:semiHidden/>
     <w:rsid w:val="00FF6F31"/>

</xml_diff>